<commit_message>
Updated documentation to reflect current implementation.
</commit_message>
<xml_diff>
--- a/Documentation/reaction diffusion.docx
+++ b/Documentation/reaction diffusion.docx
@@ -1771,10 +1771,10 @@
             <v:path o:extrusionok="f" gradientshapeok="t" o:connecttype="rect"/>
             <o:lock v:ext="edit" aspectratio="t"/>
           </v:shapetype>
-          <v:shape id="_x0000_i1356" type="#_x0000_t75" style="width:194.5pt;height:21.5pt" o:ole="">
+          <v:shape id="_x0000_i1025" type="#_x0000_t75" style="width:194.5pt;height:21.5pt" o:ole="">
             <v:imagedata r:id="rId6" o:title=""/>
           </v:shape>
-          <o:OLEObject Type="Embed" ProgID="Equation.DSMT4" ShapeID="_x0000_i1356" DrawAspect="Content" ObjectID="_1836461503" r:id="rId7"/>
+          <o:OLEObject Type="Embed" ProgID="Equation.DSMT4" ShapeID="_x0000_i1025" DrawAspect="Content" ObjectID="_1836466605" r:id="rId7"/>
         </w:object>
       </w:r>
       <w:r>
@@ -1841,7 +1841,7 @@
           <v:shape id="_x0000_i1026" type="#_x0000_t75" style="width:21.5pt;height:14.5pt" o:ole="">
             <v:imagedata r:id="rId8" o:title=""/>
           </v:shape>
-          <o:OLEObject Type="Embed" ProgID="Equation.DSMT4" ShapeID="_x0000_i1026" DrawAspect="Content" ObjectID="_1836461504" r:id="rId9"/>
+          <o:OLEObject Type="Embed" ProgID="Equation.DSMT4" ShapeID="_x0000_i1026" DrawAspect="Content" ObjectID="_1836466606" r:id="rId9"/>
         </w:object>
       </w:r>
       <w:r>
@@ -1867,10 +1867,10 @@
           <w:position w:val="-6"/>
         </w:rPr>
         <w:object w:dxaOrig="360" w:dyaOrig="340" w14:anchorId="2C0B024E">
-          <v:shape id="_x0000_i1146" type="#_x0000_t75" style="width:21.5pt;height:18.4pt" o:ole="">
+          <v:shape id="_x0000_i1027" type="#_x0000_t75" style="width:21.5pt;height:18.4pt" o:ole="">
             <v:imagedata r:id="rId10" o:title=""/>
           </v:shape>
-          <o:OLEObject Type="Embed" ProgID="Equation.DSMT4" ShapeID="_x0000_i1146" DrawAspect="Content" ObjectID="_1836461505" r:id="rId11"/>
+          <o:OLEObject Type="Embed" ProgID="Equation.DSMT4" ShapeID="_x0000_i1027" DrawAspect="Content" ObjectID="_1836466607" r:id="rId11"/>
         </w:object>
       </w:r>
       <w:r>
@@ -1920,7 +1920,7 @@
           <v:shape id="_x0000_i1028" type="#_x0000_t75" style="width:21.5pt;height:14.5pt" o:ole="">
             <v:imagedata r:id="rId12" o:title=""/>
           </v:shape>
-          <o:OLEObject Type="Embed" ProgID="Equation.DSMT4" ShapeID="_x0000_i1028" DrawAspect="Content" ObjectID="_1836461506" r:id="rId13"/>
+          <o:OLEObject Type="Embed" ProgID="Equation.DSMT4" ShapeID="_x0000_i1028" DrawAspect="Content" ObjectID="_1836466608" r:id="rId13"/>
         </w:object>
       </w:r>
       <w:r>
@@ -1952,7 +1952,7 @@
           <v:shape id="_x0000_i1029" type="#_x0000_t75" style="width:93.5pt;height:21.5pt" o:ole="">
             <v:imagedata r:id="rId14" o:title=""/>
           </v:shape>
-          <o:OLEObject Type="Embed" ProgID="Equation.DSMT4" ShapeID="_x0000_i1029" DrawAspect="Content" ObjectID="_1836461507" r:id="rId15"/>
+          <o:OLEObject Type="Embed" ProgID="Equation.DSMT4" ShapeID="_x0000_i1029" DrawAspect="Content" ObjectID="_1836466609" r:id="rId15"/>
         </w:object>
       </w:r>
       <w:r>
@@ -1968,10 +1968,10 @@
           <w:position w:val="-6"/>
         </w:rPr>
         <w:object w:dxaOrig="360" w:dyaOrig="340" w14:anchorId="3D8A7522">
-          <v:shape id="_x0000_i1359" type="#_x0000_t75" style="width:18.15pt;height:17.1pt" o:ole="">
+          <v:shape id="_x0000_i1030" type="#_x0000_t75" style="width:18.15pt;height:17.1pt" o:ole="">
             <v:imagedata r:id="rId16" o:title=""/>
           </v:shape>
-          <o:OLEObject Type="Embed" ProgID="Equation.DSMT4" ShapeID="_x0000_i1359" DrawAspect="Content" ObjectID="_1836461508" r:id="rId17"/>
+          <o:OLEObject Type="Embed" ProgID="Equation.DSMT4" ShapeID="_x0000_i1030" DrawAspect="Content" ObjectID="_1836466610" r:id="rId17"/>
         </w:object>
       </w:r>
       <w:r>
@@ -1992,10 +1992,10 @@
           <w:position w:val="-12"/>
         </w:rPr>
         <w:object w:dxaOrig="360" w:dyaOrig="400" w14:anchorId="6E0A632D">
-          <v:shape id="_x0000_i1364" type="#_x0000_t75" style="width:18.15pt;height:19.95pt" o:ole="">
+          <v:shape id="_x0000_i1031" type="#_x0000_t75" style="width:18.15pt;height:19.95pt" o:ole="">
             <v:imagedata r:id="rId18" o:title=""/>
           </v:shape>
-          <o:OLEObject Type="Embed" ProgID="Equation.DSMT4" ShapeID="_x0000_i1364" DrawAspect="Content" ObjectID="_1836461509" r:id="rId19"/>
+          <o:OLEObject Type="Embed" ProgID="Equation.DSMT4" ShapeID="_x0000_i1031" DrawAspect="Content" ObjectID="_1836466611" r:id="rId19"/>
         </w:object>
       </w:r>
       <w:r>
@@ -2016,10 +2016,10 @@
           <w:position w:val="-6"/>
         </w:rPr>
         <w:object w:dxaOrig="480" w:dyaOrig="340" w14:anchorId="1DB05DC3">
-          <v:shape id="_x0000_i1367" type="#_x0000_t75" style="width:24.1pt;height:17.1pt" o:ole="">
+          <v:shape id="_x0000_i1032" type="#_x0000_t75" style="width:24.1pt;height:17.1pt" o:ole="">
             <v:imagedata r:id="rId20" o:title=""/>
           </v:shape>
-          <o:OLEObject Type="Embed" ProgID="Equation.DSMT4" ShapeID="_x0000_i1367" DrawAspect="Content" ObjectID="_1836461510" r:id="rId21"/>
+          <o:OLEObject Type="Embed" ProgID="Equation.DSMT4" ShapeID="_x0000_i1032" DrawAspect="Content" ObjectID="_1836466612" r:id="rId21"/>
         </w:object>
       </w:r>
       <w:r>
@@ -2030,10 +2030,10 @@
           <w:position w:val="-6"/>
         </w:rPr>
         <w:object w:dxaOrig="200" w:dyaOrig="220" w14:anchorId="67A2482B">
-          <v:shape id="_x0000_i1370" type="#_x0000_t75" style="width:10.1pt;height:10.9pt" o:ole="">
+          <v:shape id="_x0000_i1033" type="#_x0000_t75" style="width:10.1pt;height:10.9pt" o:ole="">
             <v:imagedata r:id="rId22" o:title=""/>
           </v:shape>
-          <o:OLEObject Type="Embed" ProgID="Equation.DSMT4" ShapeID="_x0000_i1370" DrawAspect="Content" ObjectID="_1836461511" r:id="rId23"/>
+          <o:OLEObject Type="Embed" ProgID="Equation.DSMT4" ShapeID="_x0000_i1033" DrawAspect="Content" ObjectID="_1836466613" r:id="rId23"/>
         </w:object>
       </w:r>
       <w:r>
@@ -2052,10 +2052,10 @@
           <w:position w:val="-12"/>
         </w:rPr>
         <w:object w:dxaOrig="1560" w:dyaOrig="400" w14:anchorId="63C33FA6">
-          <v:shape id="_x0000_i1509" type="#_x0000_t75" style="width:77.95pt;height:19.95pt" o:ole="">
+          <v:shape id="_x0000_i1034" type="#_x0000_t75" style="width:77.95pt;height:19.95pt" o:ole="">
             <v:imagedata r:id="rId24" o:title=""/>
           </v:shape>
-          <o:OLEObject Type="Embed" ProgID="Equation.DSMT4" ShapeID="_x0000_i1509" DrawAspect="Content" ObjectID="_1836461512" r:id="rId25"/>
+          <o:OLEObject Type="Embed" ProgID="Equation.DSMT4" ShapeID="_x0000_i1034" DrawAspect="Content" ObjectID="_1836466614" r:id="rId25"/>
         </w:object>
       </w:r>
       <w:r>
@@ -2115,10 +2115,10 @@
           <w:position w:val="-14"/>
         </w:rPr>
         <w:object w:dxaOrig="1080" w:dyaOrig="400" w14:anchorId="46A8080B">
-          <v:shape id="_x0000_i1511" type="#_x0000_t75" style="width:58pt;height:21.5pt" o:ole="">
+          <v:shape id="_x0000_i1035" type="#_x0000_t75" style="width:58pt;height:21.5pt" o:ole="">
             <v:imagedata r:id="rId26" o:title=""/>
           </v:shape>
-          <o:OLEObject Type="Embed" ProgID="Equation.DSMT4" ShapeID="_x0000_i1511" DrawAspect="Content" ObjectID="_1836461513" r:id="rId27"/>
+          <o:OLEObject Type="Embed" ProgID="Equation.DSMT4" ShapeID="_x0000_i1035" DrawAspect="Content" ObjectID="_1836466615" r:id="rId27"/>
         </w:object>
       </w:r>
       <w:r>
@@ -2153,10 +2153,10 @@
           <w:position w:val="-12"/>
         </w:rPr>
         <w:object w:dxaOrig="1560" w:dyaOrig="400" w14:anchorId="38CA08BC">
-          <v:shape id="_x0000_i1513" type="#_x0000_t75" style="width:79.25pt;height:17.1pt" o:ole="">
+          <v:shape id="_x0000_i1036" type="#_x0000_t75" style="width:79.25pt;height:17.1pt" o:ole="">
             <v:imagedata r:id="rId28" o:title=""/>
           </v:shape>
-          <o:OLEObject Type="Embed" ProgID="Equation.DSMT4" ShapeID="_x0000_i1513" DrawAspect="Content" ObjectID="_1836461514" r:id="rId29"/>
+          <o:OLEObject Type="Embed" ProgID="Equation.DSMT4" ShapeID="_x0000_i1036" DrawAspect="Content" ObjectID="_1836466616" r:id="rId29"/>
         </w:object>
       </w:r>
       <w:r>
@@ -2215,10 +2215,10 @@
           <w:position w:val="-4"/>
         </w:rPr>
         <w:object w:dxaOrig="420" w:dyaOrig="320" w14:anchorId="67938763">
-          <v:shape id="_x0000_i1033" type="#_x0000_t75" style="width:21.5pt;height:14.5pt" o:ole="">
+          <v:shape id="_x0000_i1037" type="#_x0000_t75" style="width:21.5pt;height:14.5pt" o:ole="">
             <v:imagedata r:id="rId30" o:title=""/>
           </v:shape>
-          <o:OLEObject Type="Embed" ProgID="Equation.DSMT4" ShapeID="_x0000_i1033" DrawAspect="Content" ObjectID="_1836461515" r:id="rId31"/>
+          <o:OLEObject Type="Embed" ProgID="Equation.DSMT4" ShapeID="_x0000_i1037" DrawAspect="Content" ObjectID="_1836466617" r:id="rId31"/>
         </w:object>
       </w:r>
       <w:r>
@@ -2311,10 +2311,10 @@
           <w:position w:val="-24"/>
         </w:rPr>
         <w:object w:dxaOrig="1380" w:dyaOrig="620" w14:anchorId="4D2ABB4D">
-          <v:shape id="_x0000_i1034" type="#_x0000_t75" style="width:68.9pt;height:31.1pt" o:ole="">
+          <v:shape id="_x0000_i1038" type="#_x0000_t75" style="width:68.9pt;height:31.1pt" o:ole="">
             <v:imagedata r:id="rId32" o:title=""/>
           </v:shape>
-          <o:OLEObject Type="Embed" ProgID="Equation.DSMT4" ShapeID="_x0000_i1034" DrawAspect="Content" ObjectID="_1836461516" r:id="rId33"/>
+          <o:OLEObject Type="Embed" ProgID="Equation.DSMT4" ShapeID="_x0000_i1038" DrawAspect="Content" ObjectID="_1836466618" r:id="rId33"/>
         </w:object>
       </w:r>
     </w:p>
@@ -2345,10 +2345,10 @@
           <w:position w:val="-6"/>
         </w:rPr>
         <w:object w:dxaOrig="180" w:dyaOrig="220" w14:anchorId="50958E56">
-          <v:shape id="_x0000_i1035" type="#_x0000_t75" style="width:9.05pt;height:10.9pt" o:ole="">
+          <v:shape id="_x0000_i1039" type="#_x0000_t75" style="width:9.05pt;height:10.9pt" o:ole="">
             <v:imagedata r:id="rId34" o:title=""/>
           </v:shape>
-          <o:OLEObject Type="Embed" ProgID="Equation.DSMT4" ShapeID="_x0000_i1035" DrawAspect="Content" ObjectID="_1836461517" r:id="rId35"/>
+          <o:OLEObject Type="Embed" ProgID="Equation.DSMT4" ShapeID="_x0000_i1039" DrawAspect="Content" ObjectID="_1836466619" r:id="rId35"/>
         </w:object>
       </w:r>
       <w:r>
@@ -2535,10 +2535,10 @@
           <w:position w:val="-14"/>
         </w:rPr>
         <w:object w:dxaOrig="2620" w:dyaOrig="420" w14:anchorId="50F8C2CE">
-          <v:shape id="_x0000_i1517" type="#_x0000_t75" style="width:129.5pt;height:21.5pt" o:ole="">
+          <v:shape id="_x0000_i1040" type="#_x0000_t75" style="width:129.5pt;height:21.5pt" o:ole="">
             <v:imagedata r:id="rId36" o:title=""/>
           </v:shape>
-          <o:OLEObject Type="Embed" ProgID="Equation.DSMT4" ShapeID="_x0000_i1517" DrawAspect="Content" ObjectID="_1836461518" r:id="rId37"/>
+          <o:OLEObject Type="Embed" ProgID="Equation.DSMT4" ShapeID="_x0000_i1040" DrawAspect="Content" ObjectID="_1836466620" r:id="rId37"/>
         </w:object>
       </w:r>
       <w:r>
@@ -2600,10 +2600,10 @@
           <w:position w:val="-6"/>
         </w:rPr>
         <w:object w:dxaOrig="380" w:dyaOrig="340" w14:anchorId="6BA3F5C5">
-          <v:shape id="_x0000_i1037" type="#_x0000_t75" style="width:18.9pt;height:17.1pt" o:ole="">
+          <v:shape id="_x0000_i1041" type="#_x0000_t75" style="width:18.9pt;height:17.1pt" o:ole="">
             <v:imagedata r:id="rId38" o:title=""/>
           </v:shape>
-          <o:OLEObject Type="Embed" ProgID="Equation.DSMT4" ShapeID="_x0000_i1037" DrawAspect="Content" ObjectID="_1836461519" r:id="rId39"/>
+          <o:OLEObject Type="Embed" ProgID="Equation.DSMT4" ShapeID="_x0000_i1041" DrawAspect="Content" ObjectID="_1836466621" r:id="rId39"/>
         </w:object>
       </w:r>
       <w:r>
@@ -2634,10 +2634,10 @@
           <w:position w:val="-32"/>
         </w:rPr>
         <w:object w:dxaOrig="3960" w:dyaOrig="720" w14:anchorId="72562DE0">
-          <v:shape id="_x0000_i1519" type="#_x0000_t75" style="width:194.5pt;height:36pt" o:ole="">
+          <v:shape id="_x0000_i1042" type="#_x0000_t75" style="width:194.5pt;height:36pt" o:ole="">
             <v:imagedata r:id="rId40" o:title=""/>
           </v:shape>
-          <o:OLEObject Type="Embed" ProgID="Equation.DSMT4" ShapeID="_x0000_i1519" DrawAspect="Content" ObjectID="_1836461520" r:id="rId41"/>
+          <o:OLEObject Type="Embed" ProgID="Equation.DSMT4" ShapeID="_x0000_i1042" DrawAspect="Content" ObjectID="_1836466622" r:id="rId41"/>
         </w:object>
       </w:r>
       <w:r>
@@ -2707,14 +2707,221 @@
           <w:position w:val="-66"/>
         </w:rPr>
         <w:object w:dxaOrig="5640" w:dyaOrig="1440" w14:anchorId="6F2AF0CB">
-          <v:shape id="_x0000_i1524" type="#_x0000_t75" style="width:281.8pt;height:1in" o:ole="">
+          <v:shape id="_x0000_i1126" type="#_x0000_t75" style="width:282.05pt;height:1in" o:ole="">
             <v:imagedata r:id="rId42" o:title=""/>
+          </v:shape>
+          <o:OLEObject Type="Embed" ProgID="Equation.DSMT4" ShapeID="_x0000_i1126" DrawAspect="Content" ObjectID="_1836466623" r:id="rId43"/>
+        </w:object>
+      </w:r>
+      <w:r>
+        <w:t xml:space="preserve"> </w:t>
+      </w:r>
+      <w:r>
+        <w:tab/>
+      </w:r>
+      <w:r>
+        <w:fldChar w:fldCharType="begin"/>
+      </w:r>
+      <w:r>
+        <w:instrText xml:space="preserve"> MACROBUTTON MTPlaceRef \* MERGEFORMAT </w:instrText>
+      </w:r>
+      <w:r>
+        <w:fldChar w:fldCharType="begin"/>
+      </w:r>
+      <w:r>
+        <w:instrText xml:space="preserve"> SEQ MTEqn \h \* MERGEFORMAT </w:instrText>
+      </w:r>
+      <w:r>
+        <w:fldChar w:fldCharType="end"/>
+      </w:r>
+      <w:r>
+        <w:instrText>(</w:instrText>
+      </w:r>
+      <w:fldSimple w:instr=" SEQ MTSec \c \* Arabic \* MERGEFORMAT ">
+        <w:r>
+          <w:rPr>
+            <w:noProof/>
+          </w:rPr>
+          <w:instrText>1</w:instrText>
+        </w:r>
+      </w:fldSimple>
+      <w:r>
+        <w:instrText>.</w:instrText>
+      </w:r>
+      <w:fldSimple w:instr=" SEQ MTEqn \c \* Arabic \* MERGEFORMAT ">
+        <w:r>
+          <w:rPr>
+            <w:noProof/>
+          </w:rPr>
+          <w:instrText>6</w:instrText>
+        </w:r>
+      </w:fldSimple>
+      <w:r>
+        <w:instrText>)</w:instrText>
+      </w:r>
+      <w:r>
+        <w:fldChar w:fldCharType="end"/>
+      </w:r>
+    </w:p>
+    <w:p>
+      <w:r>
+        <w:t xml:space="preserve">Here, </w:t>
+      </w:r>
+      <w:r>
+        <w:rPr>
+          <w:position w:val="-12"/>
+        </w:rPr>
+        <w:object w:dxaOrig="1200" w:dyaOrig="400" w14:anchorId="5D6496DA">
+          <v:shape id="_x0000_i1128" type="#_x0000_t75" style="width:57.5pt;height:21.5pt" o:ole="">
+            <v:imagedata r:id="rId44" o:title=""/>
+          </v:shape>
+          <o:OLEObject Type="Embed" ProgID="Equation.DSMT4" ShapeID="_x0000_i1128" DrawAspect="Content" ObjectID="_1836466624" r:id="rId45"/>
+        </w:object>
+      </w:r>
+      <w:r>
+        <w:t xml:space="preserve">, is the </w:t>
+      </w:r>
+      <w:r>
+        <w:t xml:space="preserve">prescribed </w:t>
+      </w:r>
+      <w:r>
+        <w:t>diffusive</w:t>
+      </w:r>
+      <w:r>
+        <w:t xml:space="preserve"> </w:t>
+      </w:r>
+      <w:r>
+        <w:t>flux</w:t>
+      </w:r>
+      <w:r>
+        <w:t>.</w:t>
+      </w:r>
+      <w:r>
+        <w:t xml:space="preserve"> </w:t>
+      </w:r>
+      <w:r>
+        <w:t xml:space="preserve">To further simplify things, we’ll assume that the flow is incompressible (i.e. </w:t>
+      </w:r>
+      <w:r>
+        <w:rPr>
+          <w:position w:val="-6"/>
+        </w:rPr>
+        <w:object w:dxaOrig="859" w:dyaOrig="279" w14:anchorId="39214A27">
+          <v:shape id="_x0000_i1306" type="#_x0000_t75" style="width:43pt;height:14pt" o:ole="">
+            <v:imagedata r:id="rId46" o:title=""/>
+          </v:shape>
+          <o:OLEObject Type="Embed" ProgID="Equation.DSMT4" ShapeID="_x0000_i1306" DrawAspect="Content" ObjectID="_1836466625" r:id="rId47"/>
+        </w:object>
+      </w:r>
+      <w:r>
+        <w:t>). This allows us to write,</w:t>
+      </w:r>
+    </w:p>
+    <w:p>
+      <w:pPr>
+        <w:pStyle w:val="MTDisplayEquation"/>
+      </w:pPr>
+      <w:r>
+        <w:lastRenderedPageBreak/>
+        <w:tab/>
+      </w:r>
+      <w:r>
+        <w:rPr>
+          <w:position w:val="-66"/>
+        </w:rPr>
+        <w:object w:dxaOrig="5420" w:dyaOrig="1440" w14:anchorId="13FB1414">
+          <v:shape id="_x0000_i1302" type="#_x0000_t75" style="width:270.9pt;height:1in" o:ole="" o:bordertopcolor="this" o:borderleftcolor="this" o:borderbottomcolor="this" o:borderrightcolor="this">
+            <v:imagedata r:id="rId48" o:title=""/>
             <w10:bordertop type="single" width="4"/>
             <w10:borderleft type="single" width="4"/>
             <w10:borderbottom type="single" width="4"/>
             <w10:borderright type="single" width="4"/>
           </v:shape>
-          <o:OLEObject Type="Embed" ProgID="Equation.DSMT4" ShapeID="_x0000_i1524" DrawAspect="Content" ObjectID="_1836461521" r:id="rId43"/>
+          <o:OLEObject Type="Embed" ProgID="Equation.DSMT4" ShapeID="_x0000_i1302" DrawAspect="Content" ObjectID="_1836466626" r:id="rId49"/>
+        </w:object>
+      </w:r>
+      <w:r>
+        <w:tab/>
+      </w:r>
+      <w:r>
+        <w:fldChar w:fldCharType="begin"/>
+      </w:r>
+      <w:r>
+        <w:instrText xml:space="preserve"> MACROBUTTON MTPlaceRef \* MERGEFORMAT </w:instrText>
+      </w:r>
+      <w:r>
+        <w:fldChar w:fldCharType="begin"/>
+      </w:r>
+      <w:r>
+        <w:instrText xml:space="preserve"> SEQ MTEqn \h \* MERGEFORMAT </w:instrText>
+      </w:r>
+      <w:r>
+        <w:fldChar w:fldCharType="end"/>
+      </w:r>
+      <w:r>
+        <w:instrText>(</w:instrText>
+      </w:r>
+      <w:fldSimple w:instr=" SEQ MTSec \c \* Arabic \* MERGEFORMAT ">
+        <w:r>
+          <w:rPr>
+            <w:noProof/>
+          </w:rPr>
+          <w:instrText>1</w:instrText>
+        </w:r>
+      </w:fldSimple>
+      <w:r>
+        <w:instrText>.</w:instrText>
+      </w:r>
+      <w:fldSimple w:instr=" SEQ MTEqn \c \* Arabic \* MERGEFORMAT ">
+        <w:r>
+          <w:rPr>
+            <w:noProof/>
+          </w:rPr>
+          <w:instrText>7</w:instrText>
+        </w:r>
+      </w:fldSimple>
+      <w:r>
+        <w:instrText>)</w:instrText>
+      </w:r>
+      <w:r>
+        <w:fldChar w:fldCharType="end"/>
+      </w:r>
+    </w:p>
+    <w:p/>
+    <w:p>
+      <w:pPr>
+        <w:pStyle w:val="Heading1"/>
+      </w:pPr>
+      <w:bookmarkStart w:id="3" w:name="_Toc225519235"/>
+      <w:r>
+        <w:t>Discretization</w:t>
+      </w:r>
+      <w:bookmarkEnd w:id="3"/>
+    </w:p>
+    <w:p>
+      <w:r>
+        <w:t>Next, the finite element approximations</w:t>
+      </w:r>
+      <w:r>
+        <w:t xml:space="preserve"> are introduced.</w:t>
+      </w:r>
+    </w:p>
+    <w:p>
+      <w:pPr>
+        <w:pStyle w:val="MTDisplayEquation"/>
+      </w:pPr>
+      <w:r>
+        <w:tab/>
+      </w:r>
+      <w:r>
+        <w:rPr>
+          <w:position w:val="-28"/>
+        </w:rPr>
+        <w:object w:dxaOrig="4500" w:dyaOrig="560" w14:anchorId="76FC13D1">
+          <v:shape id="_x0000_i1045" type="#_x0000_t75" style="width:225.3pt;height:28.75pt" o:ole="">
+            <v:imagedata r:id="rId50" o:title=""/>
+          </v:shape>
+          <o:OLEObject Type="Embed" ProgID="Equation.DSMT4" ShapeID="_x0000_i1045" DrawAspect="Content" ObjectID="_1836466627" r:id="rId51"/>
         </w:object>
       </w:r>
       <w:r>
@@ -2757,7 +2964,7 @@
           <w:rPr>
             <w:noProof/>
           </w:rPr>
-          <w:instrText>6</w:instrText>
+          <w:instrText>8</w:instrText>
         </w:r>
       </w:fldSimple>
       <w:r>
@@ -2769,54 +2976,7 @@
     </w:p>
     <w:p>
       <w:r>
-        <w:t xml:space="preserve">Here, </w:t>
-      </w:r>
-      <w:r>
-        <w:rPr>
-          <w:position w:val="-12"/>
-        </w:rPr>
-        <w:object w:dxaOrig="1200" w:dyaOrig="400" w14:anchorId="5D6496DA">
-          <v:shape id="_x0000_i1253" type="#_x0000_t75" style="width:57.5pt;height:21.5pt" o:ole="">
-            <v:imagedata r:id="rId44" o:title=""/>
-          </v:shape>
-          <o:OLEObject Type="Embed" ProgID="Equation.DSMT4" ShapeID="_x0000_i1253" DrawAspect="Content" ObjectID="_1836461522" r:id="rId45"/>
-        </w:object>
-      </w:r>
-      <w:r>
-        <w:t xml:space="preserve">, is the </w:t>
-      </w:r>
-      <w:r>
-        <w:t xml:space="preserve">prescribed </w:t>
-      </w:r>
-      <w:r>
-        <w:t xml:space="preserve">total </w:t>
-      </w:r>
-      <w:r>
-        <w:t>flux</w:t>
-      </w:r>
-      <w:r>
-        <w:t>.</w:t>
-      </w:r>
-      <w:r>
-        <w:t xml:space="preserve"> Note that it contains contributions from both the diffusive flux and the advective flux. </w:t>
-      </w:r>
-    </w:p>
-    <w:p>
-      <w:pPr>
-        <w:pStyle w:val="Heading1"/>
-      </w:pPr>
-      <w:bookmarkStart w:id="3" w:name="_Toc225519235"/>
-      <w:r>
-        <w:t>Discretization</w:t>
-      </w:r>
-      <w:bookmarkEnd w:id="3"/>
-    </w:p>
-    <w:p>
-      <w:r>
-        <w:t>Next, the finite element approximations</w:t>
-      </w:r>
-      <w:r>
-        <w:t xml:space="preserve"> are introduced.</w:t>
+        <w:t>This results in the following,</w:t>
       </w:r>
     </w:p>
     <w:p>
@@ -2824,18 +2984,17 @@
         <w:pStyle w:val="MTDisplayEquation"/>
       </w:pPr>
       <w:r>
-        <w:lastRenderedPageBreak/>
-        <w:tab/>
-      </w:r>
-      <w:r>
-        <w:rPr>
-          <w:position w:val="-28"/>
-        </w:rPr>
-        <w:object w:dxaOrig="4500" w:dyaOrig="560" w14:anchorId="76FC13D1">
-          <v:shape id="_x0000_i1043" type="#_x0000_t75" style="width:225.3pt;height:28.75pt" o:ole="">
-            <v:imagedata r:id="rId46" o:title=""/>
-          </v:shape>
-          <o:OLEObject Type="Embed" ProgID="Equation.DSMT4" ShapeID="_x0000_i1043" DrawAspect="Content" ObjectID="_1836461523" r:id="rId47"/>
+        <w:tab/>
+      </w:r>
+      <w:r>
+        <w:rPr>
+          <w:position w:val="-70"/>
+        </w:rPr>
+        <w:object w:dxaOrig="6940" w:dyaOrig="1520" w14:anchorId="3F9124F9">
+          <v:shape id="_x0000_i1308" type="#_x0000_t75" style="width:343.95pt;height:79.25pt" o:ole="">
+            <v:imagedata r:id="rId52" o:title=""/>
+          </v:shape>
+          <o:OLEObject Type="Embed" ProgID="Equation.DSMT4" ShapeID="_x0000_i1308" DrawAspect="Content" ObjectID="_1836466628" r:id="rId53"/>
         </w:object>
       </w:r>
       <w:r>
@@ -2878,7 +3037,7 @@
           <w:rPr>
             <w:noProof/>
           </w:rPr>
-          <w:instrText>7</w:instrText>
+          <w:instrText>9</w:instrText>
         </w:r>
       </w:fldSimple>
       <w:r>
@@ -2890,7 +3049,7 @@
     </w:p>
     <w:p>
       <w:r>
-        <w:t>This results in the following,</w:t>
+        <w:t>This can be written as a matrix equation,</w:t>
       </w:r>
     </w:p>
     <w:p>
@@ -2902,90 +3061,17 @@
       </w:r>
       <w:r>
         <w:rPr>
-          <w:position w:val="-70"/>
-        </w:rPr>
-        <w:object w:dxaOrig="7119" w:dyaOrig="1520" w14:anchorId="3F9124F9">
-          <v:shape id="_x0000_i1044" type="#_x0000_t75" style="width:352.75pt;height:79.25pt" o:ole="">
-            <v:imagedata r:id="rId48" o:title=""/>
-          </v:shape>
-          <o:OLEObject Type="Embed" ProgID="Equation.DSMT4" ShapeID="_x0000_i1044" DrawAspect="Content" ObjectID="_1836461524" r:id="rId49"/>
-        </w:object>
-      </w:r>
-      <w:r>
-        <w:t xml:space="preserve"> </w:t>
-      </w:r>
-      <w:r>
-        <w:tab/>
-      </w:r>
-      <w:r>
-        <w:fldChar w:fldCharType="begin"/>
-      </w:r>
-      <w:r>
-        <w:instrText xml:space="preserve"> MACROBUTTON MTPlaceRef \* MERGEFORMAT </w:instrText>
-      </w:r>
-      <w:r>
-        <w:fldChar w:fldCharType="begin"/>
-      </w:r>
-      <w:r>
-        <w:instrText xml:space="preserve"> SEQ MTEqn \h \* MERGEFORMAT </w:instrText>
-      </w:r>
-      <w:r>
-        <w:fldChar w:fldCharType="end"/>
-      </w:r>
-      <w:r>
-        <w:instrText>(</w:instrText>
-      </w:r>
-      <w:fldSimple w:instr=" SEQ MTSec \c \* Arabic \* MERGEFORMAT ">
-        <w:r>
-          <w:rPr>
-            <w:noProof/>
-          </w:rPr>
-          <w:instrText>1</w:instrText>
-        </w:r>
-      </w:fldSimple>
-      <w:r>
-        <w:instrText>.</w:instrText>
-      </w:r>
-      <w:fldSimple w:instr=" SEQ MTEqn \c \* Arabic \* MERGEFORMAT ">
-        <w:r>
-          <w:rPr>
-            <w:noProof/>
-          </w:rPr>
-          <w:instrText>8</w:instrText>
-        </w:r>
-      </w:fldSimple>
-      <w:r>
-        <w:instrText>)</w:instrText>
-      </w:r>
-      <w:r>
-        <w:fldChar w:fldCharType="end"/>
-      </w:r>
-    </w:p>
-    <w:p>
-      <w:r>
-        <w:t>This can be written as a matrix equation,</w:t>
-      </w:r>
-    </w:p>
-    <w:p>
-      <w:pPr>
-        <w:pStyle w:val="MTDisplayEquation"/>
-      </w:pPr>
-      <w:r>
-        <w:tab/>
-      </w:r>
-      <w:r>
-        <w:rPr>
           <w:position w:val="-14"/>
         </w:rPr>
-        <w:object w:dxaOrig="3180" w:dyaOrig="400" w14:anchorId="3E443B99">
-          <v:shape id="_x0000_i1045" type="#_x0000_t75" style="width:159pt;height:21.5pt" o:ole="" o:bordertopcolor="this" o:borderleftcolor="this" o:borderbottomcolor="this" o:borderrightcolor="this">
-            <v:imagedata r:id="rId50" o:title=""/>
+        <w:object w:dxaOrig="3200" w:dyaOrig="400" w14:anchorId="3E443B99">
+          <v:shape id="_x0000_i1310" type="#_x0000_t75" style="width:160.05pt;height:21.5pt" o:ole="">
+            <v:imagedata r:id="rId54" o:title=""/>
             <w10:bordertop type="single" width="4"/>
             <w10:borderleft type="single" width="4"/>
             <w10:borderbottom type="single" width="4"/>
             <w10:borderright type="single" width="4"/>
           </v:shape>
-          <o:OLEObject Type="Embed" ProgID="Equation.DSMT4" ShapeID="_x0000_i1045" DrawAspect="Content" ObjectID="_1836461525" r:id="rId51"/>
+          <o:OLEObject Type="Embed" ProgID="Equation.DSMT4" ShapeID="_x0000_i1310" DrawAspect="Content" ObjectID="_1836466629" r:id="rId55"/>
         </w:object>
       </w:r>
       <w:r>
@@ -3029,7 +3115,7 @@
           <w:rPr>
             <w:noProof/>
           </w:rPr>
-          <w:instrText>9</w:instrText>
+          <w:instrText>10</w:instrText>
         </w:r>
       </w:fldSimple>
       <w:r>
@@ -3061,11 +3147,11 @@
         <w:rPr>
           <w:position w:val="-166"/>
         </w:rPr>
-        <w:object w:dxaOrig="2220" w:dyaOrig="3200" w14:anchorId="5AAF3FF0">
-          <v:shape id="_x0000_i1046" type="#_x0000_t75" style="width:108pt;height:158.5pt" o:ole="">
-            <v:imagedata r:id="rId52" o:title=""/>
-          </v:shape>
-          <o:OLEObject Type="Embed" ProgID="Equation.DSMT4" ShapeID="_x0000_i1046" DrawAspect="Content" ObjectID="_1836461526" r:id="rId53"/>
+        <w:object w:dxaOrig="2000" w:dyaOrig="3200" w14:anchorId="5AAF3FF0">
+          <v:shape id="_x0000_i1312" type="#_x0000_t75" style="width:97.4pt;height:158.5pt" o:ole="">
+            <v:imagedata r:id="rId56" o:title=""/>
+          </v:shape>
+          <o:OLEObject Type="Embed" ProgID="Equation.DSMT4" ShapeID="_x0000_i1312" DrawAspect="Content" ObjectID="_1836466630" r:id="rId57"/>
         </w:object>
       </w:r>
       <w:r>
@@ -3108,7 +3194,7 @@
           <w:rPr>
             <w:noProof/>
           </w:rPr>
-          <w:instrText>10</w:instrText>
+          <w:instrText>11</w:instrText>
         </w:r>
       </w:fldSimple>
       <w:r>
@@ -3218,10 +3304,10 @@
           <w:position w:val="-14"/>
         </w:rPr>
         <w:object w:dxaOrig="1240" w:dyaOrig="400" w14:anchorId="60B08F66">
-          <v:shape id="_x0000_i1047" type="#_x0000_t75" style="width:64.75pt;height:21.5pt" o:ole="">
-            <v:imagedata r:id="rId54" o:title=""/>
-          </v:shape>
-          <o:OLEObject Type="Embed" ProgID="Equation.DSMT4" ShapeID="_x0000_i1047" DrawAspect="Content" ObjectID="_1836461527" r:id="rId55"/>
+          <v:shape id="_x0000_i1049" type="#_x0000_t75" style="width:64.75pt;height:21.5pt" o:ole="">
+            <v:imagedata r:id="rId58" o:title=""/>
+          </v:shape>
+          <o:OLEObject Type="Embed" ProgID="Equation.DSMT4" ShapeID="_x0000_i1049" DrawAspect="Content" ObjectID="_1836466631" r:id="rId59"/>
         </w:object>
       </w:r>
       <w:r>
@@ -3247,11 +3333,11 @@
         <w:rPr>
           <w:position w:val="-32"/>
         </w:rPr>
-        <w:object w:dxaOrig="2280" w:dyaOrig="600" w14:anchorId="1E137AA2">
-          <v:shape id="_x0000_i1048" type="#_x0000_t75" style="width:115.25pt;height:28.75pt" o:ole="">
-            <v:imagedata r:id="rId56" o:title=""/>
-          </v:shape>
-          <o:OLEObject Type="Embed" ProgID="Equation.DSMT4" ShapeID="_x0000_i1048" DrawAspect="Content" ObjectID="_1836461528" r:id="rId57"/>
+        <w:object w:dxaOrig="2060" w:dyaOrig="600" w14:anchorId="1E137AA2">
+          <v:shape id="_x0000_i1314" type="#_x0000_t75" style="width:104.1pt;height:28.75pt" o:ole="">
+            <v:imagedata r:id="rId60" o:title=""/>
+          </v:shape>
+          <o:OLEObject Type="Embed" ProgID="Equation.DSMT4" ShapeID="_x0000_i1314" DrawAspect="Content" ObjectID="_1836466632" r:id="rId61"/>
         </w:object>
       </w:r>
       <w:r>
@@ -3291,7 +3377,7 @@
           <w:rPr>
             <w:noProof/>
           </w:rPr>
-          <w:instrText>11</w:instrText>
+          <w:instrText>12</w:instrText>
         </w:r>
       </w:fldSimple>
       <w:r>
@@ -3307,6 +3393,7 @@
       </w:pPr>
       <w:bookmarkStart w:id="5" w:name="_Toc225519236"/>
       <w:r>
+        <w:lastRenderedPageBreak/>
         <w:t>Time Integration</w:t>
       </w:r>
       <w:bookmarkEnd w:id="5"/>
@@ -3328,7 +3415,7 @@
       </w:r>
       <w:fldSimple w:instr=" REF ZEqnNum196813 \* Charformat \! \* MERGEFORMAT ">
         <w:r>
-          <w:instrText>(1.9)</w:instrText>
+          <w:instrText>(1.10)</w:instrText>
         </w:r>
       </w:fldSimple>
       <w:r>
@@ -3371,7 +3458,7 @@
         <w:rPr>
           <w:iCs/>
         </w:rPr>
-        <w:instrText>(1.9)</w:instrText>
+        <w:instrText>(1.10)</w:instrText>
       </w:r>
       <w:r>
         <w:rPr>
@@ -3415,10 +3502,10 @@
           <w:position w:val="-6"/>
         </w:rPr>
         <w:object w:dxaOrig="480" w:dyaOrig="279" w14:anchorId="4708D4A5">
-          <v:shape id="_x0000_i1123" type="#_x0000_t75" style="width:23.85pt;height:16.85pt" o:ole="">
-            <v:imagedata r:id="rId58" o:title=""/>
-          </v:shape>
-          <o:OLEObject Type="Embed" ProgID="Equation.DSMT4" ShapeID="_x0000_i1123" DrawAspect="Content" ObjectID="_1836461529" r:id="rId59"/>
+          <v:shape id="_x0000_i1051" type="#_x0000_t75" style="width:23.85pt;height:16.85pt" o:ole="">
+            <v:imagedata r:id="rId62" o:title=""/>
+          </v:shape>
+          <o:OLEObject Type="Embed" ProgID="Equation.DSMT4" ShapeID="_x0000_i1051" DrawAspect="Content" ObjectID="_1836466633" r:id="rId63"/>
         </w:object>
       </w:r>
       <w:r>
@@ -3440,10 +3527,10 @@
           <w:position w:val="-14"/>
         </w:rPr>
         <w:object w:dxaOrig="4099" w:dyaOrig="400" w14:anchorId="5B0741B9">
-          <v:shape id="_x0000_i1125" type="#_x0000_t75" style="width:203.05pt;height:21.5pt" o:ole="">
-            <v:imagedata r:id="rId60" o:title=""/>
-          </v:shape>
-          <o:OLEObject Type="Embed" ProgID="Equation.DSMT4" ShapeID="_x0000_i1125" DrawAspect="Content" ObjectID="_1836461530" r:id="rId61"/>
+          <v:shape id="_x0000_i1316" type="#_x0000_t75" style="width:203.05pt;height:21.5pt" o:ole="">
+            <v:imagedata r:id="rId64" o:title=""/>
+          </v:shape>
+          <o:OLEObject Type="Embed" ProgID="Equation.DSMT4" ShapeID="_x0000_i1316" DrawAspect="Content" ObjectID="_1836466634" r:id="rId65"/>
         </w:object>
       </w:r>
       <w:r>
@@ -3483,7 +3570,7 @@
           <w:rPr>
             <w:noProof/>
           </w:rPr>
-          <w:instrText>12</w:instrText>
+          <w:instrText>13</w:instrText>
         </w:r>
       </w:fldSimple>
       <w:r>
@@ -3515,7 +3602,6 @@
         <w:pStyle w:val="MTDisplayEquation"/>
       </w:pPr>
       <w:r>
-        <w:lastRenderedPageBreak/>
         <w:tab/>
       </w:r>
       <w:r>
@@ -3523,10 +3609,10 @@
           <w:position w:val="-34"/>
         </w:rPr>
         <w:object w:dxaOrig="2500" w:dyaOrig="800" w14:anchorId="40714660">
-          <v:shape id="_x0000_i1131" type="#_x0000_t75" style="width:122.5pt;height:38.85pt" o:ole="">
-            <v:imagedata r:id="rId62" o:title=""/>
-          </v:shape>
-          <o:OLEObject Type="Embed" ProgID="Equation.DSMT4" ShapeID="_x0000_i1131" DrawAspect="Content" ObjectID="_1836461531" r:id="rId63"/>
+          <v:shape id="_x0000_i1053" type="#_x0000_t75" style="width:122.5pt;height:38.85pt" o:ole="">
+            <v:imagedata r:id="rId66" o:title=""/>
+          </v:shape>
+          <o:OLEObject Type="Embed" ProgID="Equation.DSMT4" ShapeID="_x0000_i1053" DrawAspect="Content" ObjectID="_1836466635" r:id="rId67"/>
         </w:object>
       </w:r>
       <w:r>
@@ -3566,7 +3652,7 @@
           <w:rPr>
             <w:noProof/>
           </w:rPr>
-          <w:instrText>13</w:instrText>
+          <w:instrText>14</w:instrText>
         </w:r>
       </w:fldSimple>
       <w:r>
@@ -3596,130 +3682,14 @@
           <w:position w:val="-24"/>
         </w:rPr>
         <w:object w:dxaOrig="4099" w:dyaOrig="620" w14:anchorId="7DF92217">
-          <v:shape id="_x0000_i1135" type="#_x0000_t75" style="width:204.85pt;height:28.75pt" o:ole="">
-            <v:imagedata r:id="rId64" o:title=""/>
-            <w10:bordertop type="single" width="4"/>
-            <w10:borderleft type="single" width="4"/>
-            <w10:borderbottom type="single" width="4"/>
-            <w10:borderright type="single" width="4"/>
-          </v:shape>
-          <o:OLEObject Type="Embed" ProgID="Equation.DSMT4" ShapeID="_x0000_i1135" DrawAspect="Content" ObjectID="_1836461532" r:id="rId65"/>
-        </w:object>
-      </w:r>
-      <w:r>
-        <w:tab/>
-      </w:r>
-      <w:r>
-        <w:fldChar w:fldCharType="begin"/>
-      </w:r>
-      <w:r>
-        <w:instrText xml:space="preserve"> MACROBUTTON MTPlaceRef \* MERGEFORMAT </w:instrText>
-      </w:r>
-      <w:r>
-        <w:fldChar w:fldCharType="begin"/>
-      </w:r>
-      <w:r>
-        <w:instrText xml:space="preserve"> SEQ MTEqn \h \* MERGEFORMAT </w:instrText>
-      </w:r>
-      <w:r>
-        <w:fldChar w:fldCharType="end"/>
-      </w:r>
-      <w:r>
-        <w:instrText>(</w:instrText>
-      </w:r>
-      <w:fldSimple w:instr=" SEQ MTSec \c \* Arabic \* MERGEFORMAT ">
-        <w:r>
-          <w:rPr>
-            <w:noProof/>
-          </w:rPr>
-          <w:instrText>1</w:instrText>
-        </w:r>
-      </w:fldSimple>
-      <w:r>
-        <w:instrText>.</w:instrText>
-      </w:r>
-      <w:fldSimple w:instr=" SEQ MTEqn \c \* Arabic \* MERGEFORMAT ">
-        <w:r>
-          <w:rPr>
-            <w:noProof/>
-          </w:rPr>
-          <w:instrText>14</w:instrText>
-        </w:r>
-      </w:fldSimple>
-      <w:r>
-        <w:instrText>)</w:instrText>
-      </w:r>
-      <w:r>
-        <w:fldChar w:fldCharType="end"/>
-      </w:r>
-    </w:p>
-    <w:p>
-      <w:r>
-        <w:t xml:space="preserve">Here, we use the notation </w:t>
-      </w:r>
-      <w:r>
-        <w:rPr>
-          <w:position w:val="-14"/>
-        </w:rPr>
-        <w:object w:dxaOrig="2840" w:dyaOrig="400" w14:anchorId="28B485BF">
-          <v:shape id="_x0000_i1138" type="#_x0000_t75" style="width:141.95pt;height:19.95pt" o:ole="">
-            <v:imagedata r:id="rId66" o:title=""/>
-          </v:shape>
-          <o:OLEObject Type="Embed" ProgID="Equation.DSMT4" ShapeID="_x0000_i1138" DrawAspect="Content" ObjectID="_1836461533" r:id="rId67"/>
-        </w:object>
-      </w:r>
-      <w:r>
-        <w:t xml:space="preserve"> . This </w:t>
-      </w:r>
-      <w:r>
-        <w:t>is a nonlinear system of equations</w:t>
-      </w:r>
-      <w:r>
-        <w:t xml:space="preserve"> and needs to be solved using Newton’s method</w:t>
-      </w:r>
-      <w:r>
-        <w:t>.</w:t>
-      </w:r>
-      <w:r>
-        <w:t xml:space="preserve"> </w:t>
-      </w:r>
-    </w:p>
-    <w:p/>
-    <w:p>
-      <w:pPr>
-        <w:pStyle w:val="Heading1"/>
-      </w:pPr>
-      <w:bookmarkStart w:id="6" w:name="_Toc225519237"/>
-      <w:r>
-        <w:t>Linearization</w:t>
-      </w:r>
-      <w:bookmarkEnd w:id="6"/>
-    </w:p>
-    <w:p>
-      <w:r>
-        <w:t>Let’s rewrite this equation in residual form</w:t>
-      </w:r>
-    </w:p>
-    <w:p>
-      <w:pPr>
-        <w:pStyle w:val="MTDisplayEquation"/>
-      </w:pPr>
-      <w:r>
-        <w:tab/>
-      </w:r>
-      <w:r>
-        <w:rPr>
-          <w:position w:val="-24"/>
-        </w:rPr>
-        <w:object w:dxaOrig="5500" w:dyaOrig="620" w14:anchorId="324F0ACF">
-          <v:shape id="_x0000_i1140" type="#_x0000_t75" style="width:277.4pt;height:28.75pt" o:ole="">
+          <v:shape id="_x0000_i1318" type="#_x0000_t75" style="width:204.85pt;height:28.75pt" o:ole="">
             <v:imagedata r:id="rId68" o:title=""/>
             <w10:bordertop type="single" width="4"/>
             <w10:borderleft type="single" width="4"/>
             <w10:borderbottom type="single" width="4"/>
             <w10:borderright type="single" width="4"/>
           </v:shape>
-          <o:OLEObject Type="Embed" ProgID="Equation.DSMT4" ShapeID="_x0000_i1140" DrawAspect="Content" ObjectID="_1836461534" r:id="rId69"/>
+          <o:OLEObject Type="Embed" ProgID="Equation.DSMT4" ShapeID="_x0000_i1318" DrawAspect="Content" ObjectID="_1836466636" r:id="rId69"/>
         </w:object>
       </w:r>
       <w:r>
@@ -3771,7 +3741,49 @@
     </w:p>
     <w:p>
       <w:r>
-        <w:t>To apply Newton’s method, we take</w:t>
+        <w:t xml:space="preserve">Here, we use the notation </w:t>
+      </w:r>
+      <w:r>
+        <w:rPr>
+          <w:position w:val="-14"/>
+        </w:rPr>
+        <w:object w:dxaOrig="2840" w:dyaOrig="400" w14:anchorId="28B485BF">
+          <v:shape id="_x0000_i1055" type="#_x0000_t75" style="width:141.95pt;height:19.95pt" o:ole="">
+            <v:imagedata r:id="rId70" o:title=""/>
+          </v:shape>
+          <o:OLEObject Type="Embed" ProgID="Equation.DSMT4" ShapeID="_x0000_i1055" DrawAspect="Content" ObjectID="_1836466637" r:id="rId71"/>
+        </w:object>
+      </w:r>
+      <w:r>
+        <w:t xml:space="preserve"> . This </w:t>
+      </w:r>
+      <w:r>
+        <w:t>is a nonlinear system of equations</w:t>
+      </w:r>
+      <w:r>
+        <w:t xml:space="preserve"> and needs to be solved using Newton’s method</w:t>
+      </w:r>
+      <w:r>
+        <w:t>.</w:t>
+      </w:r>
+      <w:r>
+        <w:t xml:space="preserve"> </w:t>
+      </w:r>
+    </w:p>
+    <w:p/>
+    <w:p>
+      <w:pPr>
+        <w:pStyle w:val="Heading1"/>
+      </w:pPr>
+      <w:bookmarkStart w:id="6" w:name="_Toc225519237"/>
+      <w:r>
+        <w:t>Linearization</w:t>
+      </w:r>
+      <w:bookmarkEnd w:id="6"/>
+    </w:p>
+    <w:p>
+      <w:r>
+        <w:t>Let’s rewrite this equation in residual form</w:t>
       </w:r>
     </w:p>
     <w:p>
@@ -3783,227 +3795,17 @@
       </w:r>
       <w:r>
         <w:rPr>
-          <w:position w:val="-18"/>
-        </w:rPr>
-        <w:object w:dxaOrig="2900" w:dyaOrig="480" w14:anchorId="56A1E4CC">
-          <v:shape id="_x0000_i1054" type="#_x0000_t75" style="width:2in;height:21.5pt" o:ole="">
-            <v:imagedata r:id="rId70" o:title=""/>
-          </v:shape>
-          <o:OLEObject Type="Embed" ProgID="Equation.DSMT4" ShapeID="_x0000_i1054" DrawAspect="Content" ObjectID="_1836461535" r:id="rId71"/>
-        </w:object>
-      </w:r>
-      <w:r>
-        <w:tab/>
-      </w:r>
-      <w:r>
-        <w:fldChar w:fldCharType="begin"/>
-      </w:r>
-      <w:r>
-        <w:instrText xml:space="preserve"> MACROBUTTON MTPlaceRef \* MERGEFORMAT </w:instrText>
-      </w:r>
-      <w:r>
-        <w:fldChar w:fldCharType="begin"/>
-      </w:r>
-      <w:r>
-        <w:instrText xml:space="preserve"> SEQ MTEqn \h \* MERGEFORMAT </w:instrText>
-      </w:r>
-      <w:r>
-        <w:fldChar w:fldCharType="end"/>
-      </w:r>
-      <w:r>
-        <w:instrText>(</w:instrText>
-      </w:r>
-      <w:fldSimple w:instr=" SEQ MTSec \c \* Arabic \* MERGEFORMAT ">
-        <w:r>
-          <w:rPr>
-            <w:noProof/>
-          </w:rPr>
-          <w:instrText>1</w:instrText>
-        </w:r>
-      </w:fldSimple>
-      <w:r>
-        <w:instrText>.</w:instrText>
-      </w:r>
-      <w:fldSimple w:instr=" SEQ MTEqn \c \* Arabic \* MERGEFORMAT ">
-        <w:r>
-          <w:rPr>
-            <w:noProof/>
-          </w:rPr>
-          <w:instrText>16</w:instrText>
-        </w:r>
-      </w:fldSimple>
-      <w:r>
-        <w:instrText>)</w:instrText>
-      </w:r>
-      <w:r>
-        <w:fldChar w:fldCharType="end"/>
-      </w:r>
-    </w:p>
-    <w:p>
-      <w:r>
-        <w:t>Using a Taylor expansion,</w:t>
-      </w:r>
-    </w:p>
-    <w:p>
-      <w:pPr>
-        <w:pStyle w:val="MTDisplayEquation"/>
-      </w:pPr>
-      <w:r>
-        <w:tab/>
-      </w:r>
-      <w:r>
-        <w:rPr>
-          <w:position w:val="-18"/>
-        </w:rPr>
-        <w:object w:dxaOrig="4180" w:dyaOrig="480" w14:anchorId="18A236F0">
-          <v:shape id="_x0000_i1055" type="#_x0000_t75" style="width:208.75pt;height:21.5pt" o:ole="">
+          <w:position w:val="-24"/>
+        </w:rPr>
+        <w:object w:dxaOrig="5500" w:dyaOrig="620" w14:anchorId="324F0ACF">
+          <v:shape id="_x0000_i1320" type="#_x0000_t75" style="width:277.4pt;height:28.75pt" o:ole="">
             <v:imagedata r:id="rId72" o:title=""/>
-          </v:shape>
-          <o:OLEObject Type="Embed" ProgID="Equation.DSMT4" ShapeID="_x0000_i1055" DrawAspect="Content" ObjectID="_1836461536" r:id="rId73"/>
-        </w:object>
-      </w:r>
-      <w:r>
-        <w:tab/>
-      </w:r>
-      <w:r>
-        <w:fldChar w:fldCharType="begin"/>
-      </w:r>
-      <w:r>
-        <w:instrText xml:space="preserve"> MACROBUTTON MTPlaceRef \* MERGEFORMAT </w:instrText>
-      </w:r>
-      <w:r>
-        <w:fldChar w:fldCharType="begin"/>
-      </w:r>
-      <w:r>
-        <w:instrText xml:space="preserve"> SEQ MTEqn \h \* MERGEFORMAT </w:instrText>
-      </w:r>
-      <w:r>
-        <w:fldChar w:fldCharType="end"/>
-      </w:r>
-      <w:r>
-        <w:instrText>(</w:instrText>
-      </w:r>
-      <w:fldSimple w:instr=" SEQ MTSec \c \* Arabic \* MERGEFORMAT ">
-        <w:r>
-          <w:rPr>
-            <w:noProof/>
-          </w:rPr>
-          <w:instrText>1</w:instrText>
-        </w:r>
-      </w:fldSimple>
-      <w:r>
-        <w:instrText>.</w:instrText>
-      </w:r>
-      <w:fldSimple w:instr=" SEQ MTEqn \c \* Arabic \* MERGEFORMAT ">
-        <w:r>
-          <w:rPr>
-            <w:noProof/>
-          </w:rPr>
-          <w:instrText>17</w:instrText>
-        </w:r>
-      </w:fldSimple>
-      <w:r>
-        <w:instrText>)</w:instrText>
-      </w:r>
-      <w:r>
-        <w:fldChar w:fldCharType="end"/>
-      </w:r>
-    </w:p>
-    <w:p>
-      <w:r>
-        <w:t>Or, equivalently,</w:t>
-      </w:r>
-    </w:p>
-    <w:p>
-      <w:pPr>
-        <w:pStyle w:val="MTDisplayEquation"/>
-      </w:pPr>
-      <w:r>
-        <w:tab/>
-      </w:r>
-      <w:r>
-        <w:rPr>
-          <w:position w:val="-40"/>
-        </w:rPr>
-        <w:object w:dxaOrig="2420" w:dyaOrig="920" w14:anchorId="1AE3F335">
-          <v:shape id="_x0000_i1056" type="#_x0000_t75" style="width:122.5pt;height:43.25pt" o:ole="">
-            <v:imagedata r:id="rId74" o:title=""/>
-          </v:shape>
-          <o:OLEObject Type="Embed" ProgID="Equation.DSMT4" ShapeID="_x0000_i1056" DrawAspect="Content" ObjectID="_1836461537" r:id="rId75"/>
-        </w:object>
-      </w:r>
-      <w:r>
-        <w:tab/>
-      </w:r>
-      <w:r>
-        <w:fldChar w:fldCharType="begin"/>
-      </w:r>
-      <w:r>
-        <w:instrText xml:space="preserve"> MACROBUTTON MTPlaceRef \* MERGEFORMAT </w:instrText>
-      </w:r>
-      <w:r>
-        <w:fldChar w:fldCharType="begin"/>
-      </w:r>
-      <w:r>
-        <w:instrText xml:space="preserve"> SEQ MTEqn \h \* MERGEFORMAT </w:instrText>
-      </w:r>
-      <w:r>
-        <w:fldChar w:fldCharType="end"/>
-      </w:r>
-      <w:r>
-        <w:instrText>(</w:instrText>
-      </w:r>
-      <w:fldSimple w:instr=" SEQ MTSec \c \* Arabic \* MERGEFORMAT ">
-        <w:r>
-          <w:rPr>
-            <w:noProof/>
-          </w:rPr>
-          <w:instrText>1</w:instrText>
-        </w:r>
-      </w:fldSimple>
-      <w:r>
-        <w:instrText>.</w:instrText>
-      </w:r>
-      <w:fldSimple w:instr=" SEQ MTEqn \c \* Arabic \* MERGEFORMAT ">
-        <w:r>
-          <w:rPr>
-            <w:noProof/>
-          </w:rPr>
-          <w:instrText>18</w:instrText>
-        </w:r>
-      </w:fldSimple>
-      <w:r>
-        <w:instrText>)</w:instrText>
-      </w:r>
-      <w:r>
-        <w:fldChar w:fldCharType="end"/>
-      </w:r>
-    </w:p>
-    <w:p>
-      <w:r>
-        <w:t>Here,</w:t>
-      </w:r>
-    </w:p>
-    <w:p>
-      <w:pPr>
-        <w:pStyle w:val="MTDisplayEquation"/>
-      </w:pPr>
-      <w:r>
-        <w:tab/>
-      </w:r>
-      <w:r>
-        <w:rPr>
-          <w:position w:val="-24"/>
-        </w:rPr>
-        <w:object w:dxaOrig="4220" w:dyaOrig="620" w14:anchorId="05B4B5C5">
-          <v:shape id="_x0000_i1142" type="#_x0000_t75" style="width:211.1pt;height:28.75pt" o:ole="">
-            <v:imagedata r:id="rId76" o:title=""/>
             <w10:bordertop type="single" width="4"/>
             <w10:borderleft type="single" width="4"/>
             <w10:borderbottom type="single" width="4"/>
             <w10:borderright type="single" width="4"/>
           </v:shape>
-          <o:OLEObject Type="Embed" ProgID="Equation.DSMT4" ShapeID="_x0000_i1142" DrawAspect="Content" ObjectID="_1836461538" r:id="rId77"/>
+          <o:OLEObject Type="Embed" ProgID="Equation.DSMT4" ShapeID="_x0000_i1320" DrawAspect="Content" ObjectID="_1836466638" r:id="rId73"/>
         </w:object>
       </w:r>
       <w:r>
@@ -4043,6 +3845,216 @@
           <w:rPr>
             <w:noProof/>
           </w:rPr>
+          <w:instrText>16</w:instrText>
+        </w:r>
+      </w:fldSimple>
+      <w:r>
+        <w:instrText>)</w:instrText>
+      </w:r>
+      <w:r>
+        <w:fldChar w:fldCharType="end"/>
+      </w:r>
+    </w:p>
+    <w:p>
+      <w:r>
+        <w:t>To apply Newton’s method, we take</w:t>
+      </w:r>
+    </w:p>
+    <w:p>
+      <w:pPr>
+        <w:pStyle w:val="MTDisplayEquation"/>
+      </w:pPr>
+      <w:r>
+        <w:tab/>
+      </w:r>
+      <w:r>
+        <w:rPr>
+          <w:position w:val="-18"/>
+        </w:rPr>
+        <w:object w:dxaOrig="2900" w:dyaOrig="480" w14:anchorId="56A1E4CC">
+          <v:shape id="_x0000_i1057" type="#_x0000_t75" style="width:2in;height:21.5pt" o:ole="">
+            <v:imagedata r:id="rId74" o:title=""/>
+          </v:shape>
+          <o:OLEObject Type="Embed" ProgID="Equation.DSMT4" ShapeID="_x0000_i1057" DrawAspect="Content" ObjectID="_1836466639" r:id="rId75"/>
+        </w:object>
+      </w:r>
+      <w:r>
+        <w:tab/>
+      </w:r>
+      <w:r>
+        <w:fldChar w:fldCharType="begin"/>
+      </w:r>
+      <w:r>
+        <w:instrText xml:space="preserve"> MACROBUTTON MTPlaceRef \* MERGEFORMAT </w:instrText>
+      </w:r>
+      <w:r>
+        <w:fldChar w:fldCharType="begin"/>
+      </w:r>
+      <w:r>
+        <w:instrText xml:space="preserve"> SEQ MTEqn \h \* MERGEFORMAT </w:instrText>
+      </w:r>
+      <w:r>
+        <w:fldChar w:fldCharType="end"/>
+      </w:r>
+      <w:r>
+        <w:instrText>(</w:instrText>
+      </w:r>
+      <w:fldSimple w:instr=" SEQ MTSec \c \* Arabic \* MERGEFORMAT ">
+        <w:r>
+          <w:rPr>
+            <w:noProof/>
+          </w:rPr>
+          <w:instrText>1</w:instrText>
+        </w:r>
+      </w:fldSimple>
+      <w:r>
+        <w:instrText>.</w:instrText>
+      </w:r>
+      <w:fldSimple w:instr=" SEQ MTEqn \c \* Arabic \* MERGEFORMAT ">
+        <w:r>
+          <w:rPr>
+            <w:noProof/>
+          </w:rPr>
+          <w:instrText>17</w:instrText>
+        </w:r>
+      </w:fldSimple>
+      <w:r>
+        <w:instrText>)</w:instrText>
+      </w:r>
+      <w:r>
+        <w:fldChar w:fldCharType="end"/>
+      </w:r>
+    </w:p>
+    <w:p>
+      <w:r>
+        <w:t>Using a Taylor expansion,</w:t>
+      </w:r>
+    </w:p>
+    <w:p>
+      <w:pPr>
+        <w:pStyle w:val="MTDisplayEquation"/>
+      </w:pPr>
+      <w:r>
+        <w:tab/>
+      </w:r>
+      <w:r>
+        <w:rPr>
+          <w:position w:val="-18"/>
+        </w:rPr>
+        <w:object w:dxaOrig="4180" w:dyaOrig="480" w14:anchorId="18A236F0">
+          <v:shape id="_x0000_i1058" type="#_x0000_t75" style="width:208.75pt;height:21.5pt" o:ole="">
+            <v:imagedata r:id="rId76" o:title=""/>
+          </v:shape>
+          <o:OLEObject Type="Embed" ProgID="Equation.DSMT4" ShapeID="_x0000_i1058" DrawAspect="Content" ObjectID="_1836466640" r:id="rId77"/>
+        </w:object>
+      </w:r>
+      <w:r>
+        <w:tab/>
+      </w:r>
+      <w:r>
+        <w:fldChar w:fldCharType="begin"/>
+      </w:r>
+      <w:r>
+        <w:instrText xml:space="preserve"> MACROBUTTON MTPlaceRef \* MERGEFORMAT </w:instrText>
+      </w:r>
+      <w:r>
+        <w:fldChar w:fldCharType="begin"/>
+      </w:r>
+      <w:r>
+        <w:instrText xml:space="preserve"> SEQ MTEqn \h \* MERGEFORMAT </w:instrText>
+      </w:r>
+      <w:r>
+        <w:fldChar w:fldCharType="end"/>
+      </w:r>
+      <w:r>
+        <w:instrText>(</w:instrText>
+      </w:r>
+      <w:fldSimple w:instr=" SEQ MTSec \c \* Arabic \* MERGEFORMAT ">
+        <w:r>
+          <w:rPr>
+            <w:noProof/>
+          </w:rPr>
+          <w:instrText>1</w:instrText>
+        </w:r>
+      </w:fldSimple>
+      <w:r>
+        <w:instrText>.</w:instrText>
+      </w:r>
+      <w:fldSimple w:instr=" SEQ MTEqn \c \* Arabic \* MERGEFORMAT ">
+        <w:r>
+          <w:rPr>
+            <w:noProof/>
+          </w:rPr>
+          <w:instrText>18</w:instrText>
+        </w:r>
+      </w:fldSimple>
+      <w:r>
+        <w:instrText>)</w:instrText>
+      </w:r>
+      <w:r>
+        <w:fldChar w:fldCharType="end"/>
+      </w:r>
+    </w:p>
+    <w:p>
+      <w:r>
+        <w:t>Or, equivalently,</w:t>
+      </w:r>
+    </w:p>
+    <w:p>
+      <w:pPr>
+        <w:pStyle w:val="MTDisplayEquation"/>
+      </w:pPr>
+      <w:r>
+        <w:tab/>
+      </w:r>
+      <w:r>
+        <w:rPr>
+          <w:position w:val="-40"/>
+        </w:rPr>
+        <w:object w:dxaOrig="2420" w:dyaOrig="920" w14:anchorId="1AE3F335">
+          <v:shape id="_x0000_i1059" type="#_x0000_t75" style="width:122.5pt;height:43.25pt" o:ole="">
+            <v:imagedata r:id="rId78" o:title=""/>
+          </v:shape>
+          <o:OLEObject Type="Embed" ProgID="Equation.DSMT4" ShapeID="_x0000_i1059" DrawAspect="Content" ObjectID="_1836466641" r:id="rId79"/>
+        </w:object>
+      </w:r>
+      <w:r>
+        <w:tab/>
+      </w:r>
+      <w:r>
+        <w:fldChar w:fldCharType="begin"/>
+      </w:r>
+      <w:r>
+        <w:instrText xml:space="preserve"> MACROBUTTON MTPlaceRef \* MERGEFORMAT </w:instrText>
+      </w:r>
+      <w:r>
+        <w:fldChar w:fldCharType="begin"/>
+      </w:r>
+      <w:r>
+        <w:instrText xml:space="preserve"> SEQ MTEqn \h \* MERGEFORMAT </w:instrText>
+      </w:r>
+      <w:r>
+        <w:fldChar w:fldCharType="end"/>
+      </w:r>
+      <w:r>
+        <w:instrText>(</w:instrText>
+      </w:r>
+      <w:fldSimple w:instr=" SEQ MTSec \c \* Arabic \* MERGEFORMAT ">
+        <w:r>
+          <w:rPr>
+            <w:noProof/>
+          </w:rPr>
+          <w:instrText>1</w:instrText>
+        </w:r>
+      </w:fldSimple>
+      <w:r>
+        <w:instrText>.</w:instrText>
+      </w:r>
+      <w:fldSimple w:instr=" SEQ MTEqn \c \* Arabic \* MERGEFORMAT ">
+        <w:r>
+          <w:rPr>
+            <w:noProof/>
+          </w:rPr>
           <w:instrText>19</w:instrText>
         </w:r>
       </w:fldSimple>
@@ -4055,6 +4067,80 @@
     </w:p>
     <w:p>
       <w:r>
+        <w:t>Here,</w:t>
+      </w:r>
+    </w:p>
+    <w:p>
+      <w:pPr>
+        <w:pStyle w:val="MTDisplayEquation"/>
+      </w:pPr>
+      <w:r>
+        <w:tab/>
+      </w:r>
+      <w:r>
+        <w:rPr>
+          <w:position w:val="-24"/>
+        </w:rPr>
+        <w:object w:dxaOrig="4239" w:dyaOrig="620" w14:anchorId="05B4B5C5">
+          <v:shape id="_x0000_i1322" type="#_x0000_t75" style="width:211.85pt;height:28.75pt" o:ole="">
+            <v:imagedata r:id="rId80" o:title=""/>
+            <w10:bordertop type="single" width="4"/>
+            <w10:borderleft type="single" width="4"/>
+            <w10:borderbottom type="single" width="4"/>
+            <w10:borderright type="single" width="4"/>
+          </v:shape>
+          <o:OLEObject Type="Embed" ProgID="Equation.DSMT4" ShapeID="_x0000_i1322" DrawAspect="Content" ObjectID="_1836466642" r:id="rId81"/>
+        </w:object>
+      </w:r>
+      <w:r>
+        <w:tab/>
+      </w:r>
+      <w:r>
+        <w:fldChar w:fldCharType="begin"/>
+      </w:r>
+      <w:r>
+        <w:instrText xml:space="preserve"> MACROBUTTON MTPlaceRef \* MERGEFORMAT </w:instrText>
+      </w:r>
+      <w:r>
+        <w:fldChar w:fldCharType="begin"/>
+      </w:r>
+      <w:r>
+        <w:instrText xml:space="preserve"> SEQ MTEqn \h \* MERGEFORMAT </w:instrText>
+      </w:r>
+      <w:r>
+        <w:fldChar w:fldCharType="end"/>
+      </w:r>
+      <w:r>
+        <w:instrText>(</w:instrText>
+      </w:r>
+      <w:fldSimple w:instr=" SEQ MTSec \c \* Arabic \* MERGEFORMAT ">
+        <w:r>
+          <w:rPr>
+            <w:noProof/>
+          </w:rPr>
+          <w:instrText>1</w:instrText>
+        </w:r>
+      </w:fldSimple>
+      <w:r>
+        <w:instrText>.</w:instrText>
+      </w:r>
+      <w:fldSimple w:instr=" SEQ MTEqn \c \* Arabic \* MERGEFORMAT ">
+        <w:r>
+          <w:rPr>
+            <w:noProof/>
+          </w:rPr>
+          <w:instrText>20</w:instrText>
+        </w:r>
+      </w:fldSimple>
+      <w:r>
+        <w:instrText>)</w:instrText>
+      </w:r>
+      <w:r>
+        <w:fldChar w:fldCharType="end"/>
+      </w:r>
+    </w:p>
+    <w:p>
+      <w:r>
         <w:t xml:space="preserve">Here, </w:t>
       </w:r>
     </w:p>
@@ -4063,6 +4149,7 @@
         <w:pStyle w:val="MTDisplayEquation"/>
       </w:pPr>
       <w:r>
+        <w:lastRenderedPageBreak/>
         <w:tab/>
       </w:r>
       <w:r>
@@ -4070,10 +4157,10 @@
           <w:position w:val="-34"/>
         </w:rPr>
         <w:object w:dxaOrig="4040" w:dyaOrig="800" w14:anchorId="3DE4097B">
-          <v:shape id="_x0000_i1058" type="#_x0000_t75" style="width:201.5pt;height:43.25pt" o:ole="">
-            <v:imagedata r:id="rId78" o:title=""/>
-          </v:shape>
-          <o:OLEObject Type="Embed" ProgID="Equation.DSMT4" ShapeID="_x0000_i1058" DrawAspect="Content" ObjectID="_1836461539" r:id="rId79"/>
+          <v:shape id="_x0000_i1061" type="#_x0000_t75" style="width:201.5pt;height:43.25pt" o:ole="">
+            <v:imagedata r:id="rId82" o:title=""/>
+          </v:shape>
+          <o:OLEObject Type="Embed" ProgID="Equation.DSMT4" ShapeID="_x0000_i1061" DrawAspect="Content" ObjectID="_1836466643" r:id="rId83"/>
         </w:object>
       </w:r>
       <w:r>
@@ -4113,7 +4200,7 @@
           <w:rPr>
             <w:noProof/>
           </w:rPr>
-          <w:instrText>20</w:instrText>
+          <w:instrText>21</w:instrText>
         </w:r>
       </w:fldSimple>
       <w:r>
@@ -4135,10 +4222,10 @@
           <w:position w:val="-32"/>
         </w:rPr>
         <w:object w:dxaOrig="2180" w:dyaOrig="760" w14:anchorId="45A862C7">
-          <v:shape id="_x0000_i1059" type="#_x0000_t75" style="width:108pt;height:36pt" o:ole="">
-            <v:imagedata r:id="rId80" o:title=""/>
-          </v:shape>
-          <o:OLEObject Type="Embed" ProgID="Equation.DSMT4" ShapeID="_x0000_i1059" DrawAspect="Content" ObjectID="_1836461540" r:id="rId81"/>
+          <v:shape id="_x0000_i1062" type="#_x0000_t75" style="width:108pt;height:36pt" o:ole="">
+            <v:imagedata r:id="rId84" o:title=""/>
+          </v:shape>
+          <o:OLEObject Type="Embed" ProgID="Equation.DSMT4" ShapeID="_x0000_i1062" DrawAspect="Content" ObjectID="_1836466644" r:id="rId85"/>
         </w:object>
       </w:r>
       <w:r>
@@ -4178,7 +4265,7 @@
           <w:rPr>
             <w:noProof/>
           </w:rPr>
-          <w:instrText>21</w:instrText>
+          <w:instrText>22</w:instrText>
         </w:r>
       </w:fldSimple>
       <w:r>
@@ -4221,7 +4308,6 @@
         <w:pStyle w:val="MTDisplayEquation"/>
       </w:pPr>
       <w:r>
-        <w:lastRenderedPageBreak/>
         <w:tab/>
       </w:r>
       <w:r>
@@ -4229,10 +4315,10 @@
           <w:position w:val="-6"/>
         </w:rPr>
         <w:object w:dxaOrig="1500" w:dyaOrig="340" w14:anchorId="7761B949">
-          <v:shape id="_x0000_i1060" type="#_x0000_t75" style="width:1in;height:14.5pt" o:ole="">
-            <v:imagedata r:id="rId82" o:title=""/>
-          </v:shape>
-          <o:OLEObject Type="Embed" ProgID="Equation.DSMT4" ShapeID="_x0000_i1060" DrawAspect="Content" ObjectID="_1836461541" r:id="rId83"/>
+          <v:shape id="_x0000_i1063" type="#_x0000_t75" style="width:1in;height:14.5pt" o:ole="">
+            <v:imagedata r:id="rId86" o:title=""/>
+          </v:shape>
+          <o:OLEObject Type="Embed" ProgID="Equation.DSMT4" ShapeID="_x0000_i1063" DrawAspect="Content" ObjectID="_1836466645" r:id="rId87"/>
         </w:object>
       </w:r>
       <w:r>
@@ -4272,7 +4358,7 @@
           <w:rPr>
             <w:noProof/>
           </w:rPr>
-          <w:instrText>22</w:instrText>
+          <w:instrText>23</w:instrText>
         </w:r>
       </w:fldSimple>
       <w:r>
@@ -4299,10 +4385,10 @@
           <w:position w:val="-26"/>
         </w:rPr>
         <w:object w:dxaOrig="2720" w:dyaOrig="700" w14:anchorId="1516C3E1">
-          <v:shape id="_x0000_i1061" type="#_x0000_t75" style="width:136.75pt;height:36pt" o:ole="">
-            <v:imagedata r:id="rId84" o:title=""/>
-          </v:shape>
-          <o:OLEObject Type="Embed" ProgID="Equation.DSMT4" ShapeID="_x0000_i1061" DrawAspect="Content" ObjectID="_1836461542" r:id="rId85"/>
+          <v:shape id="_x0000_i1064" type="#_x0000_t75" style="width:136.75pt;height:36pt" o:ole="">
+            <v:imagedata r:id="rId88" o:title=""/>
+          </v:shape>
+          <o:OLEObject Type="Embed" ProgID="Equation.DSMT4" ShapeID="_x0000_i1064" DrawAspect="Content" ObjectID="_1836466646" r:id="rId89"/>
         </w:object>
       </w:r>
       <w:r>
@@ -4342,7 +4428,7 @@
           <w:rPr>
             <w:noProof/>
           </w:rPr>
-          <w:instrText>23</w:instrText>
+          <w:instrText>24</w:instrText>
         </w:r>
       </w:fldSimple>
       <w:r>
@@ -4386,10 +4472,10 @@
           <w:position w:val="-18"/>
         </w:rPr>
         <w:object w:dxaOrig="1939" w:dyaOrig="480" w14:anchorId="6EF11F76">
-          <v:shape id="_x0000_i1062" type="#_x0000_t75" style="width:93.5pt;height:21.5pt" o:ole="">
-            <v:imagedata r:id="rId86" o:title=""/>
-          </v:shape>
-          <o:OLEObject Type="Embed" ProgID="Equation.DSMT4" ShapeID="_x0000_i1062" DrawAspect="Content" ObjectID="_1836461543" r:id="rId87"/>
+          <v:shape id="_x0000_i1065" type="#_x0000_t75" style="width:93.5pt;height:21.5pt" o:ole="">
+            <v:imagedata r:id="rId90" o:title=""/>
+          </v:shape>
+          <o:OLEObject Type="Embed" ProgID="Equation.DSMT4" ShapeID="_x0000_i1065" DrawAspect="Content" ObjectID="_1836466647" r:id="rId91"/>
         </w:object>
       </w:r>
       <w:r>
@@ -4429,7 +4515,7 @@
           <w:rPr>
             <w:noProof/>
           </w:rPr>
-          <w:instrText>24</w:instrText>
+          <w:instrText>25</w:instrText>
         </w:r>
       </w:fldSimple>
       <w:r>
@@ -4448,10 +4534,10 @@
           <w:position w:val="-18"/>
         </w:rPr>
         <w:object w:dxaOrig="780" w:dyaOrig="480" w14:anchorId="2E916C2F">
-          <v:shape id="_x0000_i1063" type="#_x0000_t75" style="width:36pt;height:21.5pt" o:ole="">
-            <v:imagedata r:id="rId88" o:title=""/>
-          </v:shape>
-          <o:OLEObject Type="Embed" ProgID="Equation.DSMT4" ShapeID="_x0000_i1063" DrawAspect="Content" ObjectID="_1836461544" r:id="rId89"/>
+          <v:shape id="_x0000_i1066" type="#_x0000_t75" style="width:36pt;height:21.5pt" o:ole="">
+            <v:imagedata r:id="rId92" o:title=""/>
+          </v:shape>
+          <o:OLEObject Type="Embed" ProgID="Equation.DSMT4" ShapeID="_x0000_i1066" DrawAspect="Content" ObjectID="_1836466648" r:id="rId93"/>
         </w:object>
       </w:r>
       <w:r>
@@ -4470,10 +4556,10 @@
           <w:position w:val="-28"/>
         </w:rPr>
         <w:object w:dxaOrig="4800" w:dyaOrig="720" w14:anchorId="21872280">
-          <v:shape id="_x0000_i1064" type="#_x0000_t75" style="width:237.5pt;height:36pt" o:ole="">
-            <v:imagedata r:id="rId90" o:title=""/>
-          </v:shape>
-          <o:OLEObject Type="Embed" ProgID="Equation.DSMT4" ShapeID="_x0000_i1064" DrawAspect="Content" ObjectID="_1836461545" r:id="rId91"/>
+          <v:shape id="_x0000_i1067" type="#_x0000_t75" style="width:237.5pt;height:36pt" o:ole="">
+            <v:imagedata r:id="rId94" o:title=""/>
+          </v:shape>
+          <o:OLEObject Type="Embed" ProgID="Equation.DSMT4" ShapeID="_x0000_i1067" DrawAspect="Content" ObjectID="_1836466649" r:id="rId95"/>
         </w:object>
       </w:r>
       <w:r>
@@ -4513,7 +4599,7 @@
           <w:rPr>
             <w:noProof/>
           </w:rPr>
-          <w:instrText>25</w:instrText>
+          <w:instrText>26</w:instrText>
         </w:r>
       </w:fldSimple>
       <w:r>
@@ -4587,10 +4673,10 @@
           <w:position w:val="-6"/>
         </w:rPr>
         <w:object w:dxaOrig="1939" w:dyaOrig="279" w14:anchorId="16CA8FFF">
-          <v:shape id="_x0000_i1065" type="#_x0000_t75" style="width:93.5pt;height:14.5pt" o:ole="">
-            <v:imagedata r:id="rId92" o:title=""/>
-          </v:shape>
-          <o:OLEObject Type="Embed" ProgID="Equation.DSMT4" ShapeID="_x0000_i1065" DrawAspect="Content" ObjectID="_1836461546" r:id="rId93"/>
+          <v:shape id="_x0000_i1068" type="#_x0000_t75" style="width:93.5pt;height:14.5pt" o:ole="">
+            <v:imagedata r:id="rId96" o:title=""/>
+          </v:shape>
+          <o:OLEObject Type="Embed" ProgID="Equation.DSMT4" ShapeID="_x0000_i1068" DrawAspect="Content" ObjectID="_1836466650" r:id="rId97"/>
         </w:object>
       </w:r>
       <w:r>
@@ -4633,7 +4719,7 @@
           <w:rPr>
             <w:noProof/>
           </w:rPr>
-          <w:instrText>26</w:instrText>
+          <w:instrText>27</w:instrText>
         </w:r>
       </w:fldSimple>
       <w:r>
@@ -4737,10 +4823,10 @@
           <w:position w:val="-24"/>
         </w:rPr>
         <w:object w:dxaOrig="3519" w:dyaOrig="620" w14:anchorId="7402F862">
-          <v:shape id="_x0000_i1066" type="#_x0000_t75" style="width:172.75pt;height:28.75pt" o:ole="">
-            <v:imagedata r:id="rId94" o:title=""/>
-          </v:shape>
-          <o:OLEObject Type="Embed" ProgID="Equation.DSMT4" ShapeID="_x0000_i1066" DrawAspect="Content" ObjectID="_1836461547" r:id="rId95"/>
+          <v:shape id="_x0000_i1069" type="#_x0000_t75" style="width:172.75pt;height:28.75pt" o:ole="">
+            <v:imagedata r:id="rId98" o:title=""/>
+          </v:shape>
+          <o:OLEObject Type="Embed" ProgID="Equation.DSMT4" ShapeID="_x0000_i1069" DrawAspect="Content" ObjectID="_1836466651" r:id="rId99"/>
         </w:object>
       </w:r>
       <w:r>
@@ -4783,7 +4869,7 @@
           <w:rPr>
             <w:noProof/>
           </w:rPr>
-          <w:instrText>27</w:instrText>
+          <w:instrText>28</w:instrText>
         </w:r>
       </w:fldSimple>
       <w:r>
@@ -4838,6 +4924,7 @@
         <w:pStyle w:val="MTDisplayEquation"/>
       </w:pPr>
       <w:r>
+        <w:lastRenderedPageBreak/>
         <w:tab/>
       </w:r>
       <w:r>
@@ -4845,10 +4932,10 @@
           <w:position w:val="-6"/>
         </w:rPr>
         <w:object w:dxaOrig="1040" w:dyaOrig="320" w14:anchorId="30FFC422">
-          <v:shape id="_x0000_i1067" type="#_x0000_t75" style="width:50.5pt;height:14.5pt" o:ole="">
-            <v:imagedata r:id="rId96" o:title=""/>
-          </v:shape>
-          <o:OLEObject Type="Embed" ProgID="Equation.DSMT4" ShapeID="_x0000_i1067" DrawAspect="Content" ObjectID="_1836461548" r:id="rId97"/>
+          <v:shape id="_x0000_i1070" type="#_x0000_t75" style="width:50.5pt;height:14.5pt" o:ole="">
+            <v:imagedata r:id="rId100" o:title=""/>
+          </v:shape>
+          <o:OLEObject Type="Embed" ProgID="Equation.DSMT4" ShapeID="_x0000_i1070" DrawAspect="Content" ObjectID="_1836466652" r:id="rId101"/>
         </w:object>
       </w:r>
       <w:r>
@@ -4891,7 +4978,7 @@
           <w:rPr>
             <w:noProof/>
           </w:rPr>
-          <w:instrText>28</w:instrText>
+          <w:instrText>29</w:instrText>
         </w:r>
       </w:fldSimple>
       <w:r>
@@ -4989,10 +5076,10 @@
           <w:position w:val="-28"/>
         </w:rPr>
         <w:object w:dxaOrig="1920" w:dyaOrig="700" w14:anchorId="5F1421FE">
-          <v:shape id="_x0000_i1068" type="#_x0000_t75" style="width:93.5pt;height:36pt" o:ole="">
-            <v:imagedata r:id="rId98" o:title=""/>
-          </v:shape>
-          <o:OLEObject Type="Embed" ProgID="Equation.DSMT4" ShapeID="_x0000_i1068" DrawAspect="Content" ObjectID="_1836461549" r:id="rId99"/>
+          <v:shape id="_x0000_i1071" type="#_x0000_t75" style="width:93.5pt;height:36pt" o:ole="">
+            <v:imagedata r:id="rId102" o:title=""/>
+          </v:shape>
+          <o:OLEObject Type="Embed" ProgID="Equation.DSMT4" ShapeID="_x0000_i1071" DrawAspect="Content" ObjectID="_1836466653" r:id="rId103"/>
         </w:object>
       </w:r>
       <w:r>
@@ -5035,7 +5122,7 @@
           <w:rPr>
             <w:noProof/>
           </w:rPr>
-          <w:instrText>29</w:instrText>
+          <w:instrText>30</w:instrText>
         </w:r>
       </w:fldSimple>
       <w:r>
@@ -5047,7 +5134,6 @@
     </w:p>
     <w:p>
       <w:r>
-        <w:lastRenderedPageBreak/>
         <w:t xml:space="preserve">Here, </w:t>
       </w:r>
       <w:r>
@@ -5055,10 +5141,10 @@
           <w:position w:val="-12"/>
         </w:rPr>
         <w:object w:dxaOrig="340" w:dyaOrig="360" w14:anchorId="2268FEB8">
-          <v:shape id="_x0000_i1069" type="#_x0000_t75" style="width:14.5pt;height:21.5pt" o:ole="">
-            <v:imagedata r:id="rId100" o:title=""/>
-          </v:shape>
-          <o:OLEObject Type="Embed" ProgID="Equation.DSMT4" ShapeID="_x0000_i1069" DrawAspect="Content" ObjectID="_1836461550" r:id="rId101"/>
+          <v:shape id="_x0000_i1072" type="#_x0000_t75" style="width:14.5pt;height:21.5pt" o:ole="">
+            <v:imagedata r:id="rId104" o:title=""/>
+          </v:shape>
+          <o:OLEObject Type="Embed" ProgID="Equation.DSMT4" ShapeID="_x0000_i1072" DrawAspect="Content" ObjectID="_1836466654" r:id="rId105"/>
         </w:object>
       </w:r>
       <w:r>
@@ -5092,10 +5178,10 @@
           <w:position w:val="-30"/>
         </w:rPr>
         <w:object w:dxaOrig="1300" w:dyaOrig="700" w14:anchorId="31008C78">
-          <v:shape id="_x0000_i1070" type="#_x0000_t75" style="width:64.75pt;height:36pt" o:ole="">
-            <v:imagedata r:id="rId102" o:title=""/>
-          </v:shape>
-          <o:OLEObject Type="Embed" ProgID="Equation.DSMT4" ShapeID="_x0000_i1070" DrawAspect="Content" ObjectID="_1836461551" r:id="rId103"/>
+          <v:shape id="_x0000_i1073" type="#_x0000_t75" style="width:64.75pt;height:36pt" o:ole="">
+            <v:imagedata r:id="rId106" o:title=""/>
+          </v:shape>
+          <o:OLEObject Type="Embed" ProgID="Equation.DSMT4" ShapeID="_x0000_i1073" DrawAspect="Content" ObjectID="_1836466655" r:id="rId107"/>
         </w:object>
       </w:r>
       <w:r>
@@ -5138,7 +5224,7 @@
           <w:rPr>
             <w:noProof/>
           </w:rPr>
-          <w:instrText>30</w:instrText>
+          <w:instrText>31</w:instrText>
         </w:r>
       </w:fldSimple>
       <w:r>
@@ -5166,10 +5252,10 @@
           <w:position w:val="-14"/>
         </w:rPr>
         <w:object w:dxaOrig="1120" w:dyaOrig="380" w14:anchorId="7D19B733">
-          <v:shape id="_x0000_i1071" type="#_x0000_t75" style="width:57.5pt;height:21.5pt" o:ole="">
-            <v:imagedata r:id="rId104" o:title=""/>
-          </v:shape>
-          <o:OLEObject Type="Embed" ProgID="Equation.DSMT4" ShapeID="_x0000_i1071" DrawAspect="Content" ObjectID="_1836461552" r:id="rId105"/>
+          <v:shape id="_x0000_i1074" type="#_x0000_t75" style="width:57.5pt;height:21.5pt" o:ole="">
+            <v:imagedata r:id="rId108" o:title=""/>
+          </v:shape>
+          <o:OLEObject Type="Embed" ProgID="Equation.DSMT4" ShapeID="_x0000_i1074" DrawAspect="Content" ObjectID="_1836466656" r:id="rId109"/>
         </w:object>
       </w:r>
       <w:r>
@@ -5196,10 +5282,10 @@
           <w:position w:val="-28"/>
         </w:rPr>
         <w:object w:dxaOrig="1719" w:dyaOrig="680" w14:anchorId="5E961709">
-          <v:shape id="_x0000_i1072" type="#_x0000_t75" style="width:86.5pt;height:36pt" o:ole="">
-            <v:imagedata r:id="rId106" o:title=""/>
-          </v:shape>
-          <o:OLEObject Type="Embed" ProgID="Equation.DSMT4" ShapeID="_x0000_i1072" DrawAspect="Content" ObjectID="_1836461553" r:id="rId107"/>
+          <v:shape id="_x0000_i1075" type="#_x0000_t75" style="width:86.5pt;height:36pt" o:ole="">
+            <v:imagedata r:id="rId110" o:title=""/>
+          </v:shape>
+          <o:OLEObject Type="Embed" ProgID="Equation.DSMT4" ShapeID="_x0000_i1075" DrawAspect="Content" ObjectID="_1836466657" r:id="rId111"/>
         </w:object>
       </w:r>
       <w:r>
@@ -5242,7 +5328,7 @@
           <w:rPr>
             <w:noProof/>
           </w:rPr>
-          <w:instrText>31</w:instrText>
+          <w:instrText>32</w:instrText>
         </w:r>
       </w:fldSimple>
       <w:r>
@@ -5283,10 +5369,10 @@
           <w:position w:val="-14"/>
         </w:rPr>
         <w:object w:dxaOrig="760" w:dyaOrig="380" w14:anchorId="3EFEA9AF">
-          <v:shape id="_x0000_i1073" type="#_x0000_t75" style="width:36pt;height:21.5pt" o:ole="">
-            <v:imagedata r:id="rId108" o:title=""/>
-          </v:shape>
-          <o:OLEObject Type="Embed" ProgID="Equation.DSMT4" ShapeID="_x0000_i1073" DrawAspect="Content" ObjectID="_1836461554" r:id="rId109"/>
+          <v:shape id="_x0000_i1076" type="#_x0000_t75" style="width:36pt;height:21.5pt" o:ole="">
+            <v:imagedata r:id="rId112" o:title=""/>
+          </v:shape>
+          <o:OLEObject Type="Embed" ProgID="Equation.DSMT4" ShapeID="_x0000_i1076" DrawAspect="Content" ObjectID="_1836466658" r:id="rId113"/>
         </w:object>
       </w:r>
       <w:r>
@@ -5337,10 +5423,10 @@
           <w:position w:val="-32"/>
         </w:rPr>
         <w:object w:dxaOrig="2500" w:dyaOrig="700" w14:anchorId="4AC06A40">
-          <v:shape id="_x0000_i1074" type="#_x0000_t75" style="width:122.5pt;height:36pt" o:ole="">
-            <v:imagedata r:id="rId110" o:title=""/>
-          </v:shape>
-          <o:OLEObject Type="Embed" ProgID="Equation.DSMT4" ShapeID="_x0000_i1074" DrawAspect="Content" ObjectID="_1836461555" r:id="rId111"/>
+          <v:shape id="_x0000_i1077" type="#_x0000_t75" style="width:122.5pt;height:36pt" o:ole="">
+            <v:imagedata r:id="rId114" o:title=""/>
+          </v:shape>
+          <o:OLEObject Type="Embed" ProgID="Equation.DSMT4" ShapeID="_x0000_i1077" DrawAspect="Content" ObjectID="_1836466659" r:id="rId115"/>
         </w:object>
       </w:r>
       <w:r>
@@ -5383,7 +5469,7 @@
           <w:rPr>
             <w:noProof/>
           </w:rPr>
-          <w:instrText>32</w:instrText>
+          <w:instrText>33</w:instrText>
         </w:r>
       </w:fldSimple>
       <w:r>
@@ -5428,10 +5514,10 @@
           <w:position w:val="-32"/>
         </w:rPr>
         <w:object w:dxaOrig="1260" w:dyaOrig="760" w14:anchorId="52B9049F">
-          <v:shape id="_x0000_i1075" type="#_x0000_t75" style="width:64.75pt;height:36pt" o:ole="">
-            <v:imagedata r:id="rId112" o:title=""/>
-          </v:shape>
-          <o:OLEObject Type="Embed" ProgID="Equation.DSMT4" ShapeID="_x0000_i1075" DrawAspect="Content" ObjectID="_1836461556" r:id="rId113"/>
+          <v:shape id="_x0000_i1078" type="#_x0000_t75" style="width:64.75pt;height:36pt" o:ole="">
+            <v:imagedata r:id="rId116" o:title=""/>
+          </v:shape>
+          <o:OLEObject Type="Embed" ProgID="Equation.DSMT4" ShapeID="_x0000_i1078" DrawAspect="Content" ObjectID="_1836466660" r:id="rId117"/>
         </w:object>
       </w:r>
       <w:r>
@@ -5477,7 +5563,7 @@
           <w:rPr>
             <w:noProof/>
           </w:rPr>
-          <w:instrText>33</w:instrText>
+          <w:instrText>34</w:instrText>
         </w:r>
       </w:fldSimple>
       <w:r>
@@ -5506,10 +5592,10 @@
           <w:position w:val="-28"/>
         </w:rPr>
         <w:object w:dxaOrig="1579" w:dyaOrig="680" w14:anchorId="1EF32CC4">
-          <v:shape id="_x0000_i1076" type="#_x0000_t75" style="width:79.25pt;height:36pt" o:ole="">
-            <v:imagedata r:id="rId114" o:title=""/>
-          </v:shape>
-          <o:OLEObject Type="Embed" ProgID="Equation.DSMT4" ShapeID="_x0000_i1076" DrawAspect="Content" ObjectID="_1836461557" r:id="rId115"/>
+          <v:shape id="_x0000_i1079" type="#_x0000_t75" style="width:79.25pt;height:36pt" o:ole="">
+            <v:imagedata r:id="rId118" o:title=""/>
+          </v:shape>
+          <o:OLEObject Type="Embed" ProgID="Equation.DSMT4" ShapeID="_x0000_i1079" DrawAspect="Content" ObjectID="_1836466661" r:id="rId119"/>
         </w:object>
       </w:r>
       <w:r>
@@ -5552,7 +5638,7 @@
           <w:rPr>
             <w:noProof/>
           </w:rPr>
-          <w:instrText>34</w:instrText>
+          <w:instrText>35</w:instrText>
         </w:r>
       </w:fldSimple>
       <w:r>
@@ -5582,10 +5668,10 @@
           <w:position w:val="-32"/>
         </w:rPr>
         <w:object w:dxaOrig="1860" w:dyaOrig="600" w14:anchorId="72092F58">
-          <v:shape id="_x0000_i1077" type="#_x0000_t75" style="width:93.5pt;height:28.75pt" o:ole="">
-            <v:imagedata r:id="rId116" o:title=""/>
-          </v:shape>
-          <o:OLEObject Type="Embed" ProgID="Equation.DSMT4" ShapeID="_x0000_i1077" DrawAspect="Content" ObjectID="_1836461558" r:id="rId117"/>
+          <v:shape id="_x0000_i1080" type="#_x0000_t75" style="width:93.5pt;height:28.75pt" o:ole="">
+            <v:imagedata r:id="rId120" o:title=""/>
+          </v:shape>
+          <o:OLEObject Type="Embed" ProgID="Equation.DSMT4" ShapeID="_x0000_i1080" DrawAspect="Content" ObjectID="_1836466662" r:id="rId121"/>
         </w:object>
       </w:r>
       <w:r>
@@ -5628,7 +5714,7 @@
           <w:rPr>
             <w:noProof/>
           </w:rPr>
-          <w:instrText>35</w:instrText>
+          <w:instrText>36</w:instrText>
         </w:r>
       </w:fldSimple>
       <w:r>
@@ -5644,6 +5730,7 @@
       </w:pPr>
       <w:bookmarkStart w:id="9" w:name="_Toc225519240"/>
       <w:r>
+        <w:lastRenderedPageBreak/>
         <w:t>Mixtures</w:t>
       </w:r>
       <w:bookmarkEnd w:id="9"/>
@@ -5706,10 +5793,10 @@
           <w:position w:val="-6"/>
         </w:rPr>
         <w:object w:dxaOrig="340" w:dyaOrig="340" w14:anchorId="656A427F">
-          <v:shape id="_x0000_i1078" type="#_x0000_t75" style="width:14.5pt;height:14.5pt" o:ole="">
-            <v:imagedata r:id="rId118" o:title=""/>
-          </v:shape>
-          <o:OLEObject Type="Embed" ProgID="Equation.DSMT4" ShapeID="_x0000_i1078" DrawAspect="Content" ObjectID="_1836461559" r:id="rId119"/>
+          <v:shape id="_x0000_i1081" type="#_x0000_t75" style="width:14.5pt;height:14.5pt" o:ole="">
+            <v:imagedata r:id="rId122" o:title=""/>
+          </v:shape>
+          <o:OLEObject Type="Embed" ProgID="Equation.DSMT4" ShapeID="_x0000_i1081" DrawAspect="Content" ObjectID="_1836466663" r:id="rId123"/>
         </w:object>
       </w:r>
       <w:r>
@@ -5743,10 +5830,10 @@
           <w:position w:val="-10"/>
         </w:rPr>
         <w:object w:dxaOrig="1020" w:dyaOrig="380" w14:anchorId="3885E1F9">
-          <v:shape id="_x0000_i1079" type="#_x0000_t75" style="width:50.5pt;height:21.5pt" o:ole="">
-            <v:imagedata r:id="rId120" o:title=""/>
-          </v:shape>
-          <o:OLEObject Type="Embed" ProgID="Equation.DSMT4" ShapeID="_x0000_i1079" DrawAspect="Content" ObjectID="_1836461560" r:id="rId121"/>
+          <v:shape id="_x0000_i1082" type="#_x0000_t75" style="width:50.5pt;height:21.5pt" o:ole="">
+            <v:imagedata r:id="rId124" o:title=""/>
+          </v:shape>
+          <o:OLEObject Type="Embed" ProgID="Equation.DSMT4" ShapeID="_x0000_i1082" DrawAspect="Content" ObjectID="_1836466664" r:id="rId125"/>
         </w:object>
       </w:r>
       <w:r>
@@ -5789,7 +5876,7 @@
           <w:rPr>
             <w:noProof/>
           </w:rPr>
-          <w:instrText>36</w:instrText>
+          <w:instrText>37</w:instrText>
         </w:r>
       </w:fldSimple>
       <w:r>
@@ -5808,10 +5895,10 @@
           <w:position w:val="-10"/>
         </w:rPr>
         <w:object w:dxaOrig="220" w:dyaOrig="260" w14:anchorId="033ACD26">
-          <v:shape id="_x0000_i1080" type="#_x0000_t75" style="width:14.5pt;height:14.5pt" o:ole="">
-            <v:imagedata r:id="rId122" o:title=""/>
-          </v:shape>
-          <o:OLEObject Type="Embed" ProgID="Equation.DSMT4" ShapeID="_x0000_i1080" DrawAspect="Content" ObjectID="_1836461561" r:id="rId123"/>
+          <v:shape id="_x0000_i1083" type="#_x0000_t75" style="width:14.5pt;height:14.5pt" o:ole="">
+            <v:imagedata r:id="rId126" o:title=""/>
+          </v:shape>
+          <o:OLEObject Type="Embed" ProgID="Equation.DSMT4" ShapeID="_x0000_i1083" DrawAspect="Content" ObjectID="_1836466665" r:id="rId127"/>
         </w:object>
       </w:r>
       <w:r>
@@ -5840,10 +5927,10 @@
           <w:position w:val="-10"/>
         </w:rPr>
         <w:object w:dxaOrig="220" w:dyaOrig="260" w14:anchorId="78C4DB42">
-          <v:shape id="_x0000_i1081" type="#_x0000_t75" style="width:14.5pt;height:14.5pt" o:ole="">
-            <v:imagedata r:id="rId124" o:title=""/>
-          </v:shape>
-          <o:OLEObject Type="Embed" ProgID="Equation.DSMT4" ShapeID="_x0000_i1081" DrawAspect="Content" ObjectID="_1836461562" r:id="rId125"/>
+          <v:shape id="_x0000_i1084" type="#_x0000_t75" style="width:14.5pt;height:14.5pt" o:ole="">
+            <v:imagedata r:id="rId128" o:title=""/>
+          </v:shape>
+          <o:OLEObject Type="Embed" ProgID="Equation.DSMT4" ShapeID="_x0000_i1084" DrawAspect="Content" ObjectID="_1836466666" r:id="rId129"/>
         </w:object>
       </w:r>
       <w:r>
@@ -5852,7 +5939,6 @@
     </w:p>
     <w:p>
       <w:r>
-        <w:lastRenderedPageBreak/>
         <w:t>The governing equation (</w:t>
       </w:r>
       <w:r>
@@ -5891,10 +5977,10 @@
           <w:position w:val="-18"/>
         </w:rPr>
         <w:object w:dxaOrig="5260" w:dyaOrig="480" w14:anchorId="01DCED6C">
-          <v:shape id="_x0000_i1082" type="#_x0000_t75" style="width:266.5pt;height:21.5pt" o:ole="">
-            <v:imagedata r:id="rId126" o:title=""/>
-          </v:shape>
-          <o:OLEObject Type="Embed" ProgID="Equation.DSMT4" ShapeID="_x0000_i1082" DrawAspect="Content" ObjectID="_1836461563" r:id="rId127"/>
+          <v:shape id="_x0000_i1085" type="#_x0000_t75" style="width:266.5pt;height:21.5pt" o:ole="">
+            <v:imagedata r:id="rId130" o:title=""/>
+          </v:shape>
+          <o:OLEObject Type="Embed" ProgID="Equation.DSMT4" ShapeID="_x0000_i1085" DrawAspect="Content" ObjectID="_1836466667" r:id="rId131"/>
         </w:object>
       </w:r>
       <w:r>
@@ -5937,7 +6023,7 @@
           <w:rPr>
             <w:noProof/>
           </w:rPr>
-          <w:instrText>37</w:instrText>
+          <w:instrText>38</w:instrText>
         </w:r>
       </w:fldSimple>
       <w:r>
@@ -5956,10 +6042,10 @@
           <w:position w:val="-14"/>
         </w:rPr>
         <w:object w:dxaOrig="720" w:dyaOrig="400" w14:anchorId="138CE7B6">
-          <v:shape id="_x0000_i1083" type="#_x0000_t75" style="width:36pt;height:21.5pt" o:ole="">
-            <v:imagedata r:id="rId128" o:title=""/>
-          </v:shape>
-          <o:OLEObject Type="Embed" ProgID="Equation.DSMT4" ShapeID="_x0000_i1083" DrawAspect="Content" ObjectID="_1836461564" r:id="rId129"/>
+          <v:shape id="_x0000_i1086" type="#_x0000_t75" style="width:36pt;height:21.5pt" o:ole="">
+            <v:imagedata r:id="rId132" o:title=""/>
+          </v:shape>
+          <o:OLEObject Type="Embed" ProgID="Equation.DSMT4" ShapeID="_x0000_i1086" DrawAspect="Content" ObjectID="_1836466668" r:id="rId133"/>
         </w:object>
       </w:r>
       <w:r>
@@ -6023,10 +6109,10 @@
           <w:position w:val="-14"/>
         </w:rPr>
         <w:object w:dxaOrig="1620" w:dyaOrig="400" w14:anchorId="4CEF53AC">
-          <v:shape id="_x0000_i1084" type="#_x0000_t75" style="width:79.25pt;height:21.5pt" o:ole="">
-            <v:imagedata r:id="rId130" o:title=""/>
-          </v:shape>
-          <o:OLEObject Type="Embed" ProgID="Equation.DSMT4" ShapeID="_x0000_i1084" DrawAspect="Content" ObjectID="_1836461565" r:id="rId131"/>
+          <v:shape id="_x0000_i1087" type="#_x0000_t75" style="width:79.25pt;height:21.5pt" o:ole="">
+            <v:imagedata r:id="rId134" o:title=""/>
+          </v:shape>
+          <o:OLEObject Type="Embed" ProgID="Equation.DSMT4" ShapeID="_x0000_i1087" DrawAspect="Content" ObjectID="_1836466669" r:id="rId135"/>
         </w:object>
       </w:r>
     </w:p>
@@ -6055,10 +6141,10 @@
           <w:position w:val="-10"/>
         </w:rPr>
         <w:object w:dxaOrig="220" w:dyaOrig="260" w14:anchorId="2F23F40E">
-          <v:shape id="_x0000_i1085" type="#_x0000_t75" style="width:14.5pt;height:14.5pt" o:ole="">
-            <v:imagedata r:id="rId132" o:title=""/>
-          </v:shape>
-          <o:OLEObject Type="Embed" ProgID="Equation.DSMT4" ShapeID="_x0000_i1085" DrawAspect="Content" ObjectID="_1836461566" r:id="rId133"/>
+          <v:shape id="_x0000_i1088" type="#_x0000_t75" style="width:14.5pt;height:14.5pt" o:ole="">
+            <v:imagedata r:id="rId136" o:title=""/>
+          </v:shape>
+          <o:OLEObject Type="Embed" ProgID="Equation.DSMT4" ShapeID="_x0000_i1088" DrawAspect="Content" ObjectID="_1836466670" r:id="rId137"/>
         </w:object>
       </w:r>
       <w:r>
@@ -6153,10 +6239,10 @@
           <w:position w:val="-10"/>
         </w:rPr>
         <w:object w:dxaOrig="1120" w:dyaOrig="360" w14:anchorId="57E23FD6">
-          <v:shape id="_x0000_i1086" type="#_x0000_t75" style="width:57.5pt;height:21.5pt" o:ole="">
-            <v:imagedata r:id="rId134" o:title=""/>
-          </v:shape>
-          <o:OLEObject Type="Embed" ProgID="Equation.DSMT4" ShapeID="_x0000_i1086" DrawAspect="Content" ObjectID="_1836461567" r:id="rId135"/>
+          <v:shape id="_x0000_i1089" type="#_x0000_t75" style="width:57.5pt;height:21.5pt" o:ole="">
+            <v:imagedata r:id="rId138" o:title=""/>
+          </v:shape>
+          <o:OLEObject Type="Embed" ProgID="Equation.DSMT4" ShapeID="_x0000_i1089" DrawAspect="Content" ObjectID="_1836466671" r:id="rId139"/>
         </w:object>
       </w:r>
       <w:r>
@@ -6199,7 +6285,7 @@
           <w:rPr>
             <w:noProof/>
           </w:rPr>
-          <w:instrText>38</w:instrText>
+          <w:instrText>39</w:instrText>
         </w:r>
       </w:fldSimple>
       <w:r>
@@ -6235,10 +6321,10 @@
           <w:position w:val="-10"/>
         </w:rPr>
         <w:object w:dxaOrig="340" w:dyaOrig="360" w14:anchorId="1DB7E549">
-          <v:shape id="_x0000_i1087" type="#_x0000_t75" style="width:14.5pt;height:21.5pt" o:ole="">
-            <v:imagedata r:id="rId136" o:title=""/>
-          </v:shape>
-          <o:OLEObject Type="Embed" ProgID="Equation.DSMT4" ShapeID="_x0000_i1087" DrawAspect="Content" ObjectID="_1836461568" r:id="rId137"/>
+          <v:shape id="_x0000_i1090" type="#_x0000_t75" style="width:14.5pt;height:21.5pt" o:ole="">
+            <v:imagedata r:id="rId140" o:title=""/>
+          </v:shape>
+          <o:OLEObject Type="Embed" ProgID="Equation.DSMT4" ShapeID="_x0000_i1090" DrawAspect="Content" ObjectID="_1836466672" r:id="rId141"/>
         </w:object>
       </w:r>
       <w:r>
@@ -6257,10 +6343,10 @@
           <w:position w:val="-24"/>
         </w:rPr>
         <w:object w:dxaOrig="1060" w:dyaOrig="660" w14:anchorId="32E3F49E">
-          <v:shape id="_x0000_i1088" type="#_x0000_t75" style="width:50.5pt;height:36pt" o:ole="">
-            <v:imagedata r:id="rId138" o:title=""/>
-          </v:shape>
-          <o:OLEObject Type="Embed" ProgID="Equation.DSMT4" ShapeID="_x0000_i1088" DrawAspect="Content" ObjectID="_1836461569" r:id="rId139"/>
+          <v:shape id="_x0000_i1091" type="#_x0000_t75" style="width:50.5pt;height:36pt" o:ole="">
+            <v:imagedata r:id="rId142" o:title=""/>
+          </v:shape>
+          <o:OLEObject Type="Embed" ProgID="Equation.DSMT4" ShapeID="_x0000_i1091" DrawAspect="Content" ObjectID="_1836466673" r:id="rId143"/>
         </w:object>
       </w:r>
       <w:r>
@@ -6304,7 +6390,7 @@
           <w:rPr>
             <w:noProof/>
           </w:rPr>
-          <w:instrText>39</w:instrText>
+          <w:instrText>40</w:instrText>
         </w:r>
       </w:fldSimple>
       <w:r>
@@ -6317,6 +6403,7 @@
     </w:p>
     <w:p>
       <w:r>
+        <w:lastRenderedPageBreak/>
         <w:t xml:space="preserve"> where </w:t>
       </w:r>
       <w:r>
@@ -6324,10 +6411,10 @@
           <w:position w:val="-10"/>
         </w:rPr>
         <w:object w:dxaOrig="340" w:dyaOrig="360" w14:anchorId="6E2C15BB">
-          <v:shape id="_x0000_i1089" type="#_x0000_t75" style="width:14.5pt;height:21.5pt" o:ole="">
-            <v:imagedata r:id="rId140" o:title=""/>
-          </v:shape>
-          <o:OLEObject Type="Embed" ProgID="Equation.DSMT4" ShapeID="_x0000_i1089" DrawAspect="Content" ObjectID="_1836461570" r:id="rId141"/>
+          <v:shape id="_x0000_i1092" type="#_x0000_t75" style="width:14.5pt;height:21.5pt" o:ole="">
+            <v:imagedata r:id="rId144" o:title=""/>
+          </v:shape>
+          <o:OLEObject Type="Embed" ProgID="Equation.DSMT4" ShapeID="_x0000_i1092" DrawAspect="Content" ObjectID="_1836466674" r:id="rId145"/>
         </w:object>
       </w:r>
       <w:r>
@@ -6369,7 +6456,7 @@
       </w:r>
       <w:fldSimple w:instr=" REF ZEqnNum484367 \* Charformat \! \* MERGEFORMAT ">
         <w:r>
-          <w:instrText>(1.39)</w:instrText>
+          <w:instrText>(1.40)</w:instrText>
         </w:r>
       </w:fldSimple>
       <w:r>
@@ -6386,10 +6473,10 @@
           <w:position w:val="-6"/>
         </w:rPr>
         <w:object w:dxaOrig="580" w:dyaOrig="240" w14:anchorId="0D680A10">
-          <v:shape id="_x0000_i1090" type="#_x0000_t75" style="width:28.75pt;height:14.5pt" o:ole="">
-            <v:imagedata r:id="rId142" o:title=""/>
-          </v:shape>
-          <o:OLEObject Type="Embed" ProgID="Equation.DSMT4" ShapeID="_x0000_i1090" DrawAspect="Content" ObjectID="_1836461571" r:id="rId143"/>
+          <v:shape id="_x0000_i1093" type="#_x0000_t75" style="width:28.75pt;height:14.5pt" o:ole="">
+            <v:imagedata r:id="rId146" o:title=""/>
+          </v:shape>
+          <o:OLEObject Type="Embed" ProgID="Equation.DSMT4" ShapeID="_x0000_i1093" DrawAspect="Content" ObjectID="_1836466675" r:id="rId147"/>
         </w:object>
       </w:r>
       <w:r>
@@ -6408,10 +6495,10 @@
           <w:position w:val="-24"/>
         </w:rPr>
         <w:object w:dxaOrig="2079" w:dyaOrig="660" w14:anchorId="379AF4A0">
-          <v:shape id="_x0000_i1091" type="#_x0000_t75" style="width:100.75pt;height:36pt" o:ole="">
-            <v:imagedata r:id="rId144" o:title=""/>
-          </v:shape>
-          <o:OLEObject Type="Embed" ProgID="Equation.DSMT4" ShapeID="_x0000_i1091" DrawAspect="Content" ObjectID="_1836461572" r:id="rId145"/>
+          <v:shape id="_x0000_i1094" type="#_x0000_t75" style="width:100.75pt;height:36pt" o:ole="">
+            <v:imagedata r:id="rId148" o:title=""/>
+          </v:shape>
+          <o:OLEObject Type="Embed" ProgID="Equation.DSMT4" ShapeID="_x0000_i1094" DrawAspect="Content" ObjectID="_1836466676" r:id="rId149"/>
         </w:object>
       </w:r>
       <w:r>
@@ -6451,7 +6538,7 @@
           <w:rPr>
             <w:noProof/>
           </w:rPr>
-          <w:instrText>40</w:instrText>
+          <w:instrText>41</w:instrText>
         </w:r>
       </w:fldSimple>
       <w:r>
@@ -6478,10 +6565,10 @@
           <w:position w:val="-14"/>
         </w:rPr>
         <w:object w:dxaOrig="2280" w:dyaOrig="400" w14:anchorId="29ABEEF0">
-          <v:shape id="_x0000_i1092" type="#_x0000_t75" style="width:115.25pt;height:21.5pt" o:ole="">
-            <v:imagedata r:id="rId146" o:title=""/>
-          </v:shape>
-          <o:OLEObject Type="Embed" ProgID="Equation.DSMT4" ShapeID="_x0000_i1092" DrawAspect="Content" ObjectID="_1836461573" r:id="rId147"/>
+          <v:shape id="_x0000_i1095" type="#_x0000_t75" style="width:115.25pt;height:21.5pt" o:ole="">
+            <v:imagedata r:id="rId150" o:title=""/>
+          </v:shape>
+          <o:OLEObject Type="Embed" ProgID="Equation.DSMT4" ShapeID="_x0000_i1095" DrawAspect="Content" ObjectID="_1836466677" r:id="rId151"/>
         </w:object>
       </w:r>
       <w:r>
@@ -6521,7 +6608,7 @@
           <w:rPr>
             <w:noProof/>
           </w:rPr>
-          <w:instrText>41</w:instrText>
+          <w:instrText>42</w:instrText>
         </w:r>
       </w:fldSimple>
       <w:r>
@@ -6536,7 +6623,6 @@
         <w:pStyle w:val="MTDisplayEquation"/>
       </w:pPr>
       <w:r>
-        <w:lastRenderedPageBreak/>
         <w:tab/>
       </w:r>
     </w:p>
@@ -6557,10 +6643,10 @@
           <w:position w:val="-28"/>
         </w:rPr>
         <w:object w:dxaOrig="1560" w:dyaOrig="540" w14:anchorId="4B8DB178">
-          <v:shape id="_x0000_i1093" type="#_x0000_t75" style="width:79.25pt;height:28.75pt" o:ole="">
-            <v:imagedata r:id="rId148" o:title=""/>
-          </v:shape>
-          <o:OLEObject Type="Embed" ProgID="Equation.DSMT4" ShapeID="_x0000_i1093" DrawAspect="Content" ObjectID="_1836461574" r:id="rId149"/>
+          <v:shape id="_x0000_i1096" type="#_x0000_t75" style="width:79.25pt;height:28.75pt" o:ole="">
+            <v:imagedata r:id="rId152" o:title=""/>
+          </v:shape>
+          <o:OLEObject Type="Embed" ProgID="Equation.DSMT4" ShapeID="_x0000_i1096" DrawAspect="Content" ObjectID="_1836466678" r:id="rId153"/>
         </w:object>
       </w:r>
       <w:r>
@@ -6603,7 +6689,7 @@
           <w:rPr>
             <w:noProof/>
           </w:rPr>
-          <w:instrText>42</w:instrText>
+          <w:instrText>43</w:instrText>
         </w:r>
       </w:fldSimple>
       <w:r>
@@ -6638,10 +6724,10 @@
           <w:position w:val="-30"/>
         </w:rPr>
         <w:object w:dxaOrig="920" w:dyaOrig="720" w14:anchorId="15DE1D7E">
-          <v:shape id="_x0000_i1094" type="#_x0000_t75" style="width:43.25pt;height:36pt" o:ole="">
-            <v:imagedata r:id="rId150" o:title=""/>
-          </v:shape>
-          <o:OLEObject Type="Embed" ProgID="Equation.DSMT4" ShapeID="_x0000_i1094" DrawAspect="Content" ObjectID="_1836461575" r:id="rId151"/>
+          <v:shape id="_x0000_i1097" type="#_x0000_t75" style="width:43.25pt;height:36pt" o:ole="">
+            <v:imagedata r:id="rId154" o:title=""/>
+          </v:shape>
+          <o:OLEObject Type="Embed" ProgID="Equation.DSMT4" ShapeID="_x0000_i1097" DrawAspect="Content" ObjectID="_1836466679" r:id="rId155"/>
         </w:object>
       </w:r>
       <w:r>
@@ -6684,7 +6770,7 @@
           <w:rPr>
             <w:noProof/>
           </w:rPr>
-          <w:instrText>43</w:instrText>
+          <w:instrText>44</w:instrText>
         </w:r>
       </w:fldSimple>
       <w:r>
@@ -6711,10 +6797,10 @@
           <w:position w:val="-10"/>
         </w:rPr>
         <w:object w:dxaOrig="960" w:dyaOrig="360" w14:anchorId="051E1689">
-          <v:shape id="_x0000_i1095" type="#_x0000_t75" style="width:50.5pt;height:21.5pt" o:ole="">
-            <v:imagedata r:id="rId152" o:title=""/>
-          </v:shape>
-          <o:OLEObject Type="Embed" ProgID="Equation.DSMT4" ShapeID="_x0000_i1095" DrawAspect="Content" ObjectID="_1836461576" r:id="rId153"/>
+          <v:shape id="_x0000_i1098" type="#_x0000_t75" style="width:50.5pt;height:21.5pt" o:ole="">
+            <v:imagedata r:id="rId156" o:title=""/>
+          </v:shape>
+          <o:OLEObject Type="Embed" ProgID="Equation.DSMT4" ShapeID="_x0000_i1098" DrawAspect="Content" ObjectID="_1836466680" r:id="rId157"/>
         </w:object>
       </w:r>
       <w:r>
@@ -6890,10 +6976,10 @@
           <w:position w:val="-12"/>
         </w:rPr>
         <w:object w:dxaOrig="1440" w:dyaOrig="360" w14:anchorId="6E533C3D">
-          <v:shape id="_x0000_i1096" type="#_x0000_t75" style="width:1in;height:21.5pt" o:ole="">
-            <v:imagedata r:id="rId154" o:title=""/>
-          </v:shape>
-          <o:OLEObject Type="Embed" ProgID="Equation.DSMT4" ShapeID="_x0000_i1096" DrawAspect="Content" ObjectID="_1836461577" r:id="rId155"/>
+          <v:shape id="_x0000_i1099" type="#_x0000_t75" style="width:1in;height:21.5pt" o:ole="">
+            <v:imagedata r:id="rId158" o:title=""/>
+          </v:shape>
+          <o:OLEObject Type="Embed" ProgID="Equation.DSMT4" ShapeID="_x0000_i1099" DrawAspect="Content" ObjectID="_1836466681" r:id="rId159"/>
         </w:object>
       </w:r>
       <w:r>
@@ -6936,7 +7022,7 @@
           <w:rPr>
             <w:noProof/>
           </w:rPr>
-          <w:instrText>44</w:instrText>
+          <w:instrText>45</w:instrText>
         </w:r>
       </w:fldSimple>
       <w:r>
@@ -6977,10 +7063,10 @@
           <w:position w:val="-32"/>
         </w:rPr>
         <w:object w:dxaOrig="1680" w:dyaOrig="600" w14:anchorId="0A3AF264">
-          <v:shape id="_x0000_i1097" type="#_x0000_t75" style="width:86.5pt;height:28.75pt" o:ole="">
-            <v:imagedata r:id="rId156" o:title=""/>
-          </v:shape>
-          <o:OLEObject Type="Embed" ProgID="Equation.DSMT4" ShapeID="_x0000_i1097" DrawAspect="Content" ObjectID="_1836461578" r:id="rId157"/>
+          <v:shape id="_x0000_i1100" type="#_x0000_t75" style="width:86.5pt;height:28.75pt" o:ole="">
+            <v:imagedata r:id="rId160" o:title=""/>
+          </v:shape>
+          <o:OLEObject Type="Embed" ProgID="Equation.DSMT4" ShapeID="_x0000_i1100" DrawAspect="Content" ObjectID="_1836466682" r:id="rId161"/>
         </w:object>
       </w:r>
       <w:r>
@@ -7023,7 +7109,7 @@
           <w:rPr>
             <w:noProof/>
           </w:rPr>
-          <w:instrText>45</w:instrText>
+          <w:instrText>46</w:instrText>
         </w:r>
       </w:fldSimple>
       <w:r>
@@ -7035,6 +7121,7 @@
     </w:p>
     <w:p>
       <w:r>
+        <w:lastRenderedPageBreak/>
         <w:t xml:space="preserve">Let’s consider a 1D element with 2 nodes. </w:t>
       </w:r>
     </w:p>
@@ -7050,10 +7137,10 @@
           <w:position w:val="-30"/>
         </w:rPr>
         <w:object w:dxaOrig="980" w:dyaOrig="720" w14:anchorId="12718E1E">
-          <v:shape id="_x0000_i1098" type="#_x0000_t75" style="width:50.5pt;height:36pt" o:ole="">
-            <v:imagedata r:id="rId158" o:title=""/>
-          </v:shape>
-          <o:OLEObject Type="Embed" ProgID="Equation.DSMT4" ShapeID="_x0000_i1098" DrawAspect="Content" ObjectID="_1836461579" r:id="rId159"/>
+          <v:shape id="_x0000_i1101" type="#_x0000_t75" style="width:50.5pt;height:36pt" o:ole="">
+            <v:imagedata r:id="rId162" o:title=""/>
+          </v:shape>
+          <o:OLEObject Type="Embed" ProgID="Equation.DSMT4" ShapeID="_x0000_i1101" DrawAspect="Content" ObjectID="_1836466683" r:id="rId163"/>
         </w:object>
       </w:r>
       <w:r>
@@ -7096,7 +7183,7 @@
           <w:rPr>
             <w:noProof/>
           </w:rPr>
-          <w:instrText>46</w:instrText>
+          <w:instrText>47</w:instrText>
         </w:r>
       </w:fldSimple>
       <w:r>
@@ -7116,18 +7203,594 @@
         <w:pStyle w:val="MTDisplayEquation"/>
       </w:pPr>
       <w:r>
+        <w:tab/>
+      </w:r>
+      <w:r>
+        <w:rPr>
+          <w:position w:val="-108"/>
+        </w:rPr>
+        <w:object w:dxaOrig="2860" w:dyaOrig="2280" w14:anchorId="2965D9AF">
+          <v:shape id="_x0000_i1102" type="#_x0000_t75" style="width:2in;height:115.25pt" o:ole="">
+            <v:imagedata r:id="rId164" o:title=""/>
+          </v:shape>
+          <o:OLEObject Type="Embed" ProgID="Equation.DSMT4" ShapeID="_x0000_i1102" DrawAspect="Content" ObjectID="_1836466684" r:id="rId165"/>
+        </w:object>
+      </w:r>
+      <w:r>
+        <w:t xml:space="preserve"> </w:t>
+      </w:r>
+      <w:r>
+        <w:tab/>
+      </w:r>
+      <w:r>
+        <w:fldChar w:fldCharType="begin"/>
+      </w:r>
+      <w:r>
+        <w:instrText xml:space="preserve"> MACROBUTTON MTPlaceRef \* MERGEFORMAT </w:instrText>
+      </w:r>
+      <w:r>
+        <w:fldChar w:fldCharType="begin"/>
+      </w:r>
+      <w:r>
+        <w:instrText xml:space="preserve"> SEQ MTEqn \h \* MERGEFORMAT </w:instrText>
+      </w:r>
+      <w:r>
+        <w:fldChar w:fldCharType="end"/>
+      </w:r>
+      <w:r>
+        <w:instrText>(</w:instrText>
+      </w:r>
+      <w:fldSimple w:instr=" SEQ MTSec \c \* Arabic \* MERGEFORMAT ">
+        <w:r>
+          <w:rPr>
+            <w:noProof/>
+          </w:rPr>
+          <w:instrText>1</w:instrText>
+        </w:r>
+      </w:fldSimple>
+      <w:r>
+        <w:instrText>.</w:instrText>
+      </w:r>
+      <w:fldSimple w:instr=" SEQ MTEqn \c \* Arabic \* MERGEFORMAT ">
+        <w:r>
+          <w:rPr>
+            <w:noProof/>
+          </w:rPr>
+          <w:instrText>48</w:instrText>
+        </w:r>
+      </w:fldSimple>
+      <w:r>
+        <w:instrText>)</w:instrText>
+      </w:r>
+      <w:r>
+        <w:fldChar w:fldCharType="end"/>
+      </w:r>
+    </w:p>
+    <w:p>
+      <w:pPr>
+        <w:pStyle w:val="MTDisplayEquation"/>
+      </w:pPr>
+      <w:r>
+        <w:tab/>
+      </w:r>
+      <w:r>
+        <w:rPr>
+          <w:position w:val="-30"/>
+        </w:rPr>
+        <w:object w:dxaOrig="1420" w:dyaOrig="720" w14:anchorId="435CDEAC">
+          <v:shape id="_x0000_i1103" type="#_x0000_t75" style="width:1in;height:36pt" o:ole="">
+            <v:imagedata r:id="rId166" o:title=""/>
+          </v:shape>
+          <o:OLEObject Type="Embed" ProgID="Equation.DSMT4" ShapeID="_x0000_i1103" DrawAspect="Content" ObjectID="_1836466685" r:id="rId167"/>
+        </w:object>
+      </w:r>
+      <w:r>
+        <w:t xml:space="preserve"> </w:t>
+      </w:r>
+      <w:r>
+        <w:tab/>
+      </w:r>
+      <w:r>
+        <w:fldChar w:fldCharType="begin"/>
+      </w:r>
+      <w:r>
+        <w:instrText xml:space="preserve"> MACROBUTTON MTPlaceRef \* MERGEFORMAT </w:instrText>
+      </w:r>
+      <w:r>
+        <w:fldChar w:fldCharType="begin"/>
+      </w:r>
+      <w:r>
+        <w:instrText xml:space="preserve"> SEQ MTEqn \h \* MERGEFORMAT </w:instrText>
+      </w:r>
+      <w:r>
+        <w:fldChar w:fldCharType="end"/>
+      </w:r>
+      <w:r>
+        <w:instrText>(</w:instrText>
+      </w:r>
+      <w:fldSimple w:instr=" SEQ MTSec \c \* Arabic \* MERGEFORMAT ">
+        <w:r>
+          <w:rPr>
+            <w:noProof/>
+          </w:rPr>
+          <w:instrText>1</w:instrText>
+        </w:r>
+      </w:fldSimple>
+      <w:r>
+        <w:instrText>.</w:instrText>
+      </w:r>
+      <w:fldSimple w:instr=" SEQ MTEqn \c \* Arabic \* MERGEFORMAT ">
+        <w:r>
+          <w:rPr>
+            <w:noProof/>
+          </w:rPr>
+          <w:instrText>49</w:instrText>
+        </w:r>
+      </w:fldSimple>
+      <w:r>
+        <w:instrText>)</w:instrText>
+      </w:r>
+      <w:r>
+        <w:fldChar w:fldCharType="end"/>
+      </w:r>
+    </w:p>
+    <w:p>
+      <w:r>
+        <w:t xml:space="preserve">The prescribed solution is given by </w:t>
+      </w:r>
+      <w:r>
+        <w:rPr>
+          <w:position w:val="-14"/>
+        </w:rPr>
+        <w:object w:dxaOrig="940" w:dyaOrig="400" w14:anchorId="5CD74CFE">
+          <v:shape id="_x0000_i1104" type="#_x0000_t75" style="width:50.5pt;height:21.5pt" o:ole="">
+            <v:imagedata r:id="rId168" o:title=""/>
+          </v:shape>
+          <o:OLEObject Type="Embed" ProgID="Equation.DSMT4" ShapeID="_x0000_i1104" DrawAspect="Content" ObjectID="_1836466686" r:id="rId169"/>
+        </w:object>
+      </w:r>
+      <w:r>
+        <w:t xml:space="preserve"> and </w:t>
+      </w:r>
+      <w:r>
+        <w:rPr>
+          <w:position w:val="-14"/>
+        </w:rPr>
+        <w:object w:dxaOrig="900" w:dyaOrig="400" w14:anchorId="4AB18450">
+          <v:shape id="_x0000_i1105" type="#_x0000_t75" style="width:43.25pt;height:21.5pt" o:ole="">
+            <v:imagedata r:id="rId170" o:title=""/>
+          </v:shape>
+          <o:OLEObject Type="Embed" ProgID="Equation.DSMT4" ShapeID="_x0000_i1105" DrawAspect="Content" ObjectID="_1836466687" r:id="rId171"/>
+        </w:object>
+      </w:r>
+      <w:r>
+        <w:t xml:space="preserve">. Thus, </w:t>
+      </w:r>
+      <w:r>
+        <w:rPr>
+          <w:position w:val="-14"/>
+        </w:rPr>
+        <w:object w:dxaOrig="1060" w:dyaOrig="400" w14:anchorId="172DDB50">
+          <v:shape id="_x0000_i1106" type="#_x0000_t75" style="width:50.5pt;height:21.5pt" o:ole="">
+            <v:imagedata r:id="rId172" o:title=""/>
+          </v:shape>
+          <o:OLEObject Type="Embed" ProgID="Equation.DSMT4" ShapeID="_x0000_i1106" DrawAspect="Content" ObjectID="_1836466688" r:id="rId173"/>
+        </w:object>
+      </w:r>
+      <w:r>
+        <w:t>. From this,</w:t>
+      </w:r>
+    </w:p>
+    <w:p>
+      <w:pPr>
+        <w:pStyle w:val="MTDisplayEquation"/>
+      </w:pPr>
+      <w:r>
+        <w:tab/>
+      </w:r>
+      <w:r>
+        <w:rPr>
+          <w:position w:val="-24"/>
+        </w:rPr>
+        <w:object w:dxaOrig="1260" w:dyaOrig="620" w14:anchorId="55435544">
+          <v:shape id="_x0000_i1107" type="#_x0000_t75" style="width:64.75pt;height:28.75pt" o:ole="">
+            <v:imagedata r:id="rId174" o:title=""/>
+          </v:shape>
+          <o:OLEObject Type="Embed" ProgID="Equation.DSMT4" ShapeID="_x0000_i1107" DrawAspect="Content" ObjectID="_1836466689" r:id="rId175"/>
+        </w:object>
+      </w:r>
+      <w:r>
+        <w:t xml:space="preserve"> </w:t>
+      </w:r>
+      <w:r>
+        <w:tab/>
+      </w:r>
+      <w:r>
+        <w:fldChar w:fldCharType="begin"/>
+      </w:r>
+      <w:r>
+        <w:instrText xml:space="preserve"> MACROBUTTON MTPlaceRef \* MERGEFORMAT </w:instrText>
+      </w:r>
+      <w:r>
+        <w:fldChar w:fldCharType="begin"/>
+      </w:r>
+      <w:r>
+        <w:instrText xml:space="preserve"> SEQ MTEqn \h \* MERGEFORMAT </w:instrText>
+      </w:r>
+      <w:r>
+        <w:fldChar w:fldCharType="end"/>
+      </w:r>
+      <w:r>
+        <w:instrText>(</w:instrText>
+      </w:r>
+      <w:fldSimple w:instr=" SEQ MTSec \c \* Arabic \* MERGEFORMAT ">
+        <w:r>
+          <w:rPr>
+            <w:noProof/>
+          </w:rPr>
+          <w:instrText>1</w:instrText>
+        </w:r>
+      </w:fldSimple>
+      <w:r>
+        <w:instrText>.</w:instrText>
+      </w:r>
+      <w:fldSimple w:instr=" SEQ MTEqn \c \* Arabic \* MERGEFORMAT ">
+        <w:r>
+          <w:rPr>
+            <w:noProof/>
+          </w:rPr>
+          <w:instrText>50</w:instrText>
+        </w:r>
+      </w:fldSimple>
+      <w:r>
+        <w:instrText>)</w:instrText>
+      </w:r>
+      <w:r>
+        <w:fldChar w:fldCharType="end"/>
+      </w:r>
+    </w:p>
+    <w:p>
+      <w:r>
+        <w:t xml:space="preserve">  </w:t>
+      </w:r>
+    </w:p>
+    <w:p>
+      <w:r>
+        <w:t>Or in general,</w:t>
+      </w:r>
+    </w:p>
+    <w:p>
+      <w:pPr>
+        <w:pStyle w:val="MTDisplayEquation"/>
+      </w:pPr>
+      <w:r>
+        <w:tab/>
+      </w:r>
+      <w:r>
+        <w:rPr>
+          <w:position w:val="-24"/>
+        </w:rPr>
+        <w:object w:dxaOrig="2900" w:dyaOrig="620" w14:anchorId="132AFD4E">
+          <v:shape id="_x0000_i1108" type="#_x0000_t75" style="width:2in;height:28.75pt" o:ole="">
+            <v:imagedata r:id="rId176" o:title=""/>
+          </v:shape>
+          <o:OLEObject Type="Embed" ProgID="Equation.DSMT4" ShapeID="_x0000_i1108" DrawAspect="Content" ObjectID="_1836466690" r:id="rId177"/>
+        </w:object>
+      </w:r>
+      <w:r>
+        <w:t xml:space="preserve"> </w:t>
+      </w:r>
+      <w:r>
+        <w:tab/>
+      </w:r>
+      <w:r>
+        <w:fldChar w:fldCharType="begin"/>
+      </w:r>
+      <w:r>
+        <w:instrText xml:space="preserve"> MACROBUTTON MTPlaceRef \* MERGEFORMAT </w:instrText>
+      </w:r>
+      <w:r>
+        <w:fldChar w:fldCharType="begin"/>
+      </w:r>
+      <w:r>
+        <w:instrText xml:space="preserve"> SEQ MTEqn \h \* MERGEFORMAT </w:instrText>
+      </w:r>
+      <w:r>
+        <w:fldChar w:fldCharType="end"/>
+      </w:r>
+      <w:r>
+        <w:instrText>(</w:instrText>
+      </w:r>
+      <w:fldSimple w:instr=" SEQ MTSec \c \* Arabic \* MERGEFORMAT ">
+        <w:r>
+          <w:rPr>
+            <w:noProof/>
+          </w:rPr>
+          <w:instrText>1</w:instrText>
+        </w:r>
+      </w:fldSimple>
+      <w:r>
+        <w:instrText>.</w:instrText>
+      </w:r>
+      <w:fldSimple w:instr=" SEQ MTEqn \c \* Arabic \* MERGEFORMAT ">
+        <w:r>
+          <w:rPr>
+            <w:noProof/>
+          </w:rPr>
+          <w:instrText>51</w:instrText>
+        </w:r>
+      </w:fldSimple>
+      <w:r>
+        <w:instrText>)</w:instrText>
+      </w:r>
+      <w:r>
+        <w:fldChar w:fldCharType="end"/>
+      </w:r>
+    </w:p>
+    <w:p>
+      <w:r>
+        <w:t xml:space="preserve">Assuming the increment in </w:t>
+      </w:r>
+      <w:r>
+        <w:rPr>
+          <w:i/>
+        </w:rPr>
+        <w:t xml:space="preserve">u1 </w:t>
+      </w:r>
+      <w:r>
+        <w:t xml:space="preserve">is </w:t>
+      </w:r>
+      <w:r>
+        <w:rPr>
+          <w:i/>
+        </w:rPr>
+        <w:t>d</w:t>
+      </w:r>
+      <w:r>
+        <w:t>, then</w:t>
+      </w:r>
+    </w:p>
+    <w:p>
+      <w:pPr>
+        <w:pStyle w:val="MTDisplayEquation"/>
+      </w:pPr>
+      <w:r>
+        <w:tab/>
+      </w:r>
+      <w:r>
+        <w:rPr>
+          <w:position w:val="-24"/>
+        </w:rPr>
+        <w:object w:dxaOrig="1660" w:dyaOrig="620" w14:anchorId="73444684">
+          <v:shape id="_x0000_i1109" type="#_x0000_t75" style="width:79.25pt;height:28.75pt" o:ole="">
+            <v:imagedata r:id="rId178" o:title=""/>
+          </v:shape>
+          <o:OLEObject Type="Embed" ProgID="Equation.DSMT4" ShapeID="_x0000_i1109" DrawAspect="Content" ObjectID="_1836466691" r:id="rId179"/>
+        </w:object>
+      </w:r>
+      <w:r>
+        <w:t xml:space="preserve"> </w:t>
+      </w:r>
+      <w:r>
+        <w:tab/>
+      </w:r>
+      <w:r>
+        <w:fldChar w:fldCharType="begin"/>
+      </w:r>
+      <w:r>
+        <w:instrText xml:space="preserve"> MACROBUTTON MTPlaceRef \* MERGEFORMAT </w:instrText>
+      </w:r>
+      <w:r>
+        <w:fldChar w:fldCharType="begin"/>
+      </w:r>
+      <w:r>
+        <w:instrText xml:space="preserve"> SEQ MTEqn \h \* MERGEFORMAT </w:instrText>
+      </w:r>
+      <w:r>
+        <w:fldChar w:fldCharType="end"/>
+      </w:r>
+      <w:r>
+        <w:instrText>(</w:instrText>
+      </w:r>
+      <w:fldSimple w:instr=" SEQ MTSec \c \* Arabic \* MERGEFORMAT ">
+        <w:r>
+          <w:rPr>
+            <w:noProof/>
+          </w:rPr>
+          <w:instrText>1</w:instrText>
+        </w:r>
+      </w:fldSimple>
+      <w:r>
+        <w:instrText>.</w:instrText>
+      </w:r>
+      <w:fldSimple w:instr=" SEQ MTEqn \c \* Arabic \* MERGEFORMAT ">
+        <w:r>
+          <w:rPr>
+            <w:noProof/>
+          </w:rPr>
+          <w:instrText>52</w:instrText>
+        </w:r>
+      </w:fldSimple>
+      <w:r>
+        <w:instrText>)</w:instrText>
+      </w:r>
+      <w:r>
+        <w:fldChar w:fldCharType="end"/>
+      </w:r>
+    </w:p>
+    <w:p>
+      <w:r>
+        <w:t>In 3D</w:t>
+      </w:r>
+    </w:p>
+    <w:p>
+      <w:pPr>
+        <w:pStyle w:val="MTDisplayEquation"/>
+      </w:pPr>
+      <w:r>
+        <w:tab/>
+      </w:r>
+      <w:r>
+        <w:rPr>
+          <w:position w:val="-24"/>
+        </w:rPr>
+        <w:object w:dxaOrig="3060" w:dyaOrig="620" w14:anchorId="1D52241A">
+          <v:shape id="_x0000_i1110" type="#_x0000_t75" style="width:151.25pt;height:28.75pt" o:ole="">
+            <v:imagedata r:id="rId180" o:title=""/>
+          </v:shape>
+          <o:OLEObject Type="Embed" ProgID="Equation.DSMT4" ShapeID="_x0000_i1110" DrawAspect="Content" ObjectID="_1836466692" r:id="rId181"/>
+        </w:object>
+      </w:r>
+      <w:r>
+        <w:t xml:space="preserve"> </w:t>
+      </w:r>
+      <w:r>
+        <w:tab/>
+      </w:r>
+      <w:r>
+        <w:fldChar w:fldCharType="begin"/>
+      </w:r>
+      <w:r>
+        <w:instrText xml:space="preserve"> MACROBUTTON MTPlaceRef \* MERGEFORMAT </w:instrText>
+      </w:r>
+      <w:r>
+        <w:fldChar w:fldCharType="begin"/>
+      </w:r>
+      <w:r>
+        <w:instrText xml:space="preserve"> SEQ MTEqn \h \* MERGEFORMAT </w:instrText>
+      </w:r>
+      <w:r>
+        <w:fldChar w:fldCharType="end"/>
+      </w:r>
+      <w:r>
+        <w:instrText>(</w:instrText>
+      </w:r>
+      <w:fldSimple w:instr=" SEQ MTSec \c \* Arabic \* MERGEFORMAT ">
+        <w:r>
+          <w:rPr>
+            <w:noProof/>
+          </w:rPr>
+          <w:instrText>1</w:instrText>
+        </w:r>
+      </w:fldSimple>
+      <w:r>
+        <w:instrText>.</w:instrText>
+      </w:r>
+      <w:fldSimple w:instr=" SEQ MTEqn \c \* Arabic \* MERGEFORMAT ">
+        <w:r>
+          <w:rPr>
+            <w:noProof/>
+          </w:rPr>
+          <w:instrText>53</w:instrText>
+        </w:r>
+      </w:fldSimple>
+      <w:r>
+        <w:instrText>)</w:instrText>
+      </w:r>
+      <w:r>
+        <w:fldChar w:fldCharType="end"/>
+      </w:r>
+    </w:p>
+    <w:p>
+      <w:r>
+        <w:t>Thus,</w:t>
+      </w:r>
+    </w:p>
+    <w:p>
+      <w:pPr>
+        <w:pStyle w:val="MTDisplayEquation"/>
+      </w:pPr>
+      <w:r>
+        <w:tab/>
+      </w:r>
+      <w:r>
+        <w:rPr>
+          <w:position w:val="-66"/>
+        </w:rPr>
+        <w:object w:dxaOrig="4959" w:dyaOrig="1440" w14:anchorId="733FAD85">
+          <v:shape id="_x0000_i1111" type="#_x0000_t75" style="width:244.75pt;height:1in" o:ole="">
+            <v:imagedata r:id="rId182" o:title=""/>
+          </v:shape>
+          <o:OLEObject Type="Embed" ProgID="Equation.DSMT4" ShapeID="_x0000_i1111" DrawAspect="Content" ObjectID="_1836466693" r:id="rId183"/>
+        </w:object>
+      </w:r>
+      <w:r>
+        <w:t xml:space="preserve"> </w:t>
+      </w:r>
+      <w:r>
+        <w:tab/>
+      </w:r>
+      <w:r>
+        <w:fldChar w:fldCharType="begin"/>
+      </w:r>
+      <w:r>
+        <w:instrText xml:space="preserve"> MACROBUTTON MTPlaceRef \* MERGEFORMAT </w:instrText>
+      </w:r>
+      <w:r>
+        <w:fldChar w:fldCharType="begin"/>
+      </w:r>
+      <w:r>
+        <w:instrText xml:space="preserve"> SEQ MTEqn \h \* MERGEFORMAT </w:instrText>
+      </w:r>
+      <w:r>
+        <w:fldChar w:fldCharType="end"/>
+      </w:r>
+      <w:r>
+        <w:instrText>(</w:instrText>
+      </w:r>
+      <w:fldSimple w:instr=" SEQ MTSec \c \* Arabic \* MERGEFORMAT ">
+        <w:r>
+          <w:rPr>
+            <w:noProof/>
+          </w:rPr>
+          <w:instrText>1</w:instrText>
+        </w:r>
+      </w:fldSimple>
+      <w:r>
+        <w:instrText>.</w:instrText>
+      </w:r>
+      <w:fldSimple w:instr=" SEQ MTEqn \c \* Arabic \* MERGEFORMAT ">
+        <w:r>
+          <w:rPr>
+            <w:noProof/>
+          </w:rPr>
+          <w:instrText>54</w:instrText>
+        </w:r>
+      </w:fldSimple>
+      <w:r>
+        <w:instrText>)</w:instrText>
+      </w:r>
+      <w:r>
+        <w:fldChar w:fldCharType="end"/>
+      </w:r>
+    </w:p>
+    <w:p>
+      <w:pPr>
+        <w:pStyle w:val="Heading1"/>
+      </w:pPr>
+      <w:bookmarkStart w:id="13" w:name="_Toc225519243"/>
+      <w:r>
         <w:lastRenderedPageBreak/>
-        <w:tab/>
-      </w:r>
-      <w:r>
-        <w:rPr>
-          <w:position w:val="-108"/>
-        </w:rPr>
-        <w:object w:dxaOrig="2860" w:dyaOrig="2280" w14:anchorId="2965D9AF">
-          <v:shape id="_x0000_i1099" type="#_x0000_t75" style="width:2in;height:115.25pt" o:ole="">
-            <v:imagedata r:id="rId160" o:title=""/>
-          </v:shape>
-          <o:OLEObject Type="Embed" ProgID="Equation.DSMT4" ShapeID="_x0000_i1099" DrawAspect="Content" ObjectID="_1836461580" r:id="rId161"/>
+        <w:t>Prescribed concentrations in NL analyses</w:t>
+      </w:r>
+      <w:bookmarkEnd w:id="13"/>
+    </w:p>
+    <w:p>
+      <w:pPr>
+        <w:pStyle w:val="MTDisplayEquation"/>
+      </w:pPr>
+      <w:r>
+        <w:tab/>
+      </w:r>
+      <w:r>
+        <w:rPr>
+          <w:position w:val="-16"/>
+        </w:rPr>
+        <w:object w:dxaOrig="2220" w:dyaOrig="440" w14:anchorId="6CF0AA5F">
+          <v:shape id="_x0000_i1112" type="#_x0000_t75" style="width:108pt;height:21.5pt" o:ole="">
+            <v:imagedata r:id="rId184" o:title=""/>
+          </v:shape>
+          <o:OLEObject Type="Embed" ProgID="Equation.DSMT4" ShapeID="_x0000_i1112" DrawAspect="Content" ObjectID="_1836466694" r:id="rId185"/>
         </w:object>
       </w:r>
       <w:r>
@@ -7170,7 +7833,7 @@
           <w:rPr>
             <w:noProof/>
           </w:rPr>
-          <w:instrText>47</w:instrText>
+          <w:instrText>55</w:instrText>
         </w:r>
       </w:fldSimple>
       <w:r>
@@ -7189,13 +7852,13 @@
       </w:r>
       <w:r>
         <w:rPr>
-          <w:position w:val="-30"/>
-        </w:rPr>
-        <w:object w:dxaOrig="1420" w:dyaOrig="720" w14:anchorId="435CDEAC">
-          <v:shape id="_x0000_i1100" type="#_x0000_t75" style="width:1in;height:36pt" o:ole="">
-            <v:imagedata r:id="rId162" o:title=""/>
-          </v:shape>
-          <o:OLEObject Type="Embed" ProgID="Equation.DSMT4" ShapeID="_x0000_i1100" DrawAspect="Content" ObjectID="_1836461581" r:id="rId163"/>
+          <w:position w:val="-16"/>
+        </w:rPr>
+        <w:object w:dxaOrig="5360" w:dyaOrig="440" w14:anchorId="67C4DD72">
+          <v:shape id="_x0000_i1113" type="#_x0000_t75" style="width:266.5pt;height:21.5pt" o:ole="">
+            <v:imagedata r:id="rId186" o:title=""/>
+          </v:shape>
+          <o:OLEObject Type="Embed" ProgID="Equation.DSMT4" ShapeID="_x0000_i1113" DrawAspect="Content" ObjectID="_1836466695" r:id="rId187"/>
         </w:object>
       </w:r>
       <w:r>
@@ -7238,7 +7901,7 @@
           <w:rPr>
             <w:noProof/>
           </w:rPr>
-          <w:instrText>48</w:instrText>
+          <w:instrText>56</w:instrText>
         </w:r>
       </w:fldSimple>
       <w:r>
@@ -7249,50 +7912,31 @@
       </w:r>
     </w:p>
     <w:p>
-      <w:r>
-        <w:t xml:space="preserve">The prescribed solution is given by </w:t>
-      </w:r>
-      <w:r>
-        <w:rPr>
-          <w:position w:val="-14"/>
-        </w:rPr>
-        <w:object w:dxaOrig="940" w:dyaOrig="400" w14:anchorId="5CD74CFE">
-          <v:shape id="_x0000_i1101" type="#_x0000_t75" style="width:50.5pt;height:21.5pt" o:ole="">
-            <v:imagedata r:id="rId164" o:title=""/>
-          </v:shape>
-          <o:OLEObject Type="Embed" ProgID="Equation.DSMT4" ShapeID="_x0000_i1101" DrawAspect="Content" ObjectID="_1836461582" r:id="rId165"/>
-        </w:object>
-      </w:r>
-      <w:r>
-        <w:t xml:space="preserve"> and </w:t>
-      </w:r>
-      <w:r>
-        <w:rPr>
-          <w:position w:val="-14"/>
-        </w:rPr>
-        <w:object w:dxaOrig="900" w:dyaOrig="400" w14:anchorId="4AB18450">
-          <v:shape id="_x0000_i1102" type="#_x0000_t75" style="width:43.25pt;height:21.5pt" o:ole="">
-            <v:imagedata r:id="rId166" o:title=""/>
-          </v:shape>
-          <o:OLEObject Type="Embed" ProgID="Equation.DSMT4" ShapeID="_x0000_i1102" DrawAspect="Content" ObjectID="_1836461583" r:id="rId167"/>
-        </w:object>
-      </w:r>
-      <w:r>
-        <w:t xml:space="preserve">. Thus, </w:t>
-      </w:r>
-      <w:r>
-        <w:rPr>
-          <w:position w:val="-14"/>
-        </w:rPr>
-        <w:object w:dxaOrig="1060" w:dyaOrig="400" w14:anchorId="172DDB50">
-          <v:shape id="_x0000_i1103" type="#_x0000_t75" style="width:50.5pt;height:21.5pt" o:ole="">
-            <v:imagedata r:id="rId168" o:title=""/>
-          </v:shape>
-          <o:OLEObject Type="Embed" ProgID="Equation.DSMT4" ShapeID="_x0000_i1103" DrawAspect="Content" ObjectID="_1836461584" r:id="rId169"/>
-        </w:object>
-      </w:r>
-      <w:r>
-        <w:t>. From this,</w:t>
+      <w:pPr>
+        <w:pStyle w:val="Heading1"/>
+      </w:pPr>
+      <w:bookmarkStart w:id="14" w:name="_Toc225519244"/>
+      <w:r>
+        <w:t>Analytical solutions for diffusion equations</w:t>
+      </w:r>
+      <w:bookmarkEnd w:id="14"/>
+    </w:p>
+    <w:p>
+      <w:pPr>
+        <w:pStyle w:val="Heading2"/>
+      </w:pPr>
+      <w:bookmarkStart w:id="15" w:name="_Toc225519245"/>
+      <w:r>
+        <w:t>Example 1</w:t>
+      </w:r>
+      <w:bookmarkEnd w:id="15"/>
+      <w:r>
+        <w:t xml:space="preserve"> </w:t>
+      </w:r>
+    </w:p>
+    <w:p>
+      <w:r>
+        <w:t>Consider the following 1D - IC/BC problem,</w:t>
       </w:r>
     </w:p>
     <w:p>
@@ -7304,13 +7948,13 @@
       </w:r>
       <w:r>
         <w:rPr>
-          <w:position w:val="-24"/>
-        </w:rPr>
-        <w:object w:dxaOrig="1260" w:dyaOrig="620" w14:anchorId="55435544">
-          <v:shape id="_x0000_i1104" type="#_x0000_t75" style="width:64.75pt;height:28.75pt" o:ole="">
-            <v:imagedata r:id="rId170" o:title=""/>
-          </v:shape>
-          <o:OLEObject Type="Embed" ProgID="Equation.DSMT4" ShapeID="_x0000_i1104" DrawAspect="Content" ObjectID="_1836461585" r:id="rId171"/>
+          <w:position w:val="-54"/>
+        </w:rPr>
+        <w:object w:dxaOrig="3040" w:dyaOrig="1160" w14:anchorId="06703DA7">
+          <v:shape id="_x0000_i1114" type="#_x0000_t75" style="width:151.25pt;height:57.5pt" o:ole="">
+            <v:imagedata r:id="rId188" o:title=""/>
+          </v:shape>
+          <o:OLEObject Type="Embed" ProgID="Equation.DSMT4" ShapeID="_x0000_i1114" DrawAspect="Content" ObjectID="_1836466696" r:id="rId189"/>
         </w:object>
       </w:r>
       <w:r>
@@ -7353,7 +7997,7 @@
           <w:rPr>
             <w:noProof/>
           </w:rPr>
-          <w:instrText>49</w:instrText>
+          <w:instrText>57</w:instrText>
         </w:r>
       </w:fldSimple>
       <w:r>
@@ -7365,12 +8009,7 @@
     </w:p>
     <w:p>
       <w:r>
-        <w:t xml:space="preserve">  </w:t>
-      </w:r>
-    </w:p>
-    <w:p>
-      <w:r>
-        <w:t>Or in general,</w:t>
+        <w:t>The solution is given by,</w:t>
       </w:r>
     </w:p>
     <w:p>
@@ -7382,13 +8021,13 @@
       </w:r>
       <w:r>
         <w:rPr>
-          <w:position w:val="-24"/>
-        </w:rPr>
-        <w:object w:dxaOrig="2900" w:dyaOrig="620" w14:anchorId="132AFD4E">
-          <v:shape id="_x0000_i1105" type="#_x0000_t75" style="width:2in;height:28.75pt" o:ole="">
-            <v:imagedata r:id="rId172" o:title=""/>
-          </v:shape>
-          <o:OLEObject Type="Embed" ProgID="Equation.DSMT4" ShapeID="_x0000_i1105" DrawAspect="Content" ObjectID="_1836461586" r:id="rId173"/>
+          <w:position w:val="-66"/>
+        </w:rPr>
+        <w:object w:dxaOrig="2980" w:dyaOrig="1440" w14:anchorId="1AF9DDFA">
+          <v:shape id="_x0000_i1115" type="#_x0000_t75" style="width:151.25pt;height:1in" o:ole="">
+            <v:imagedata r:id="rId190" o:title=""/>
+          </v:shape>
+          <o:OLEObject Type="Embed" ProgID="Equation.DSMT4" ShapeID="_x0000_i1115" DrawAspect="Content" ObjectID="_1836466697" r:id="rId191"/>
         </w:object>
       </w:r>
       <w:r>
@@ -7431,7 +8070,7 @@
           <w:rPr>
             <w:noProof/>
           </w:rPr>
-          <w:instrText>50</w:instrText>
+          <w:instrText>58</w:instrText>
         </w:r>
       </w:fldSimple>
       <w:r>
@@ -7442,26 +8081,18 @@
       </w:r>
     </w:p>
     <w:p>
-      <w:r>
-        <w:t xml:space="preserve">Assuming the increment in </w:t>
-      </w:r>
-      <w:r>
-        <w:rPr>
-          <w:i/>
-        </w:rPr>
-        <w:t xml:space="preserve">u1 </w:t>
-      </w:r>
-      <w:r>
-        <w:t xml:space="preserve">is </w:t>
-      </w:r>
-      <w:r>
-        <w:rPr>
-          <w:i/>
-        </w:rPr>
-        <w:t>d</w:t>
-      </w:r>
-      <w:r>
-        <w:t>, then</w:t>
+      <w:pPr>
+        <w:pStyle w:val="Heading2"/>
+      </w:pPr>
+      <w:bookmarkStart w:id="16" w:name="_Toc225519246"/>
+      <w:r>
+        <w:t>Example 2</w:t>
+      </w:r>
+      <w:bookmarkEnd w:id="16"/>
+    </w:p>
+    <w:p>
+      <w:r>
+        <w:t>Consider the following 1D - IC/BC problem,</w:t>
       </w:r>
     </w:p>
     <w:p>
@@ -7473,13 +8104,13 @@
       </w:r>
       <w:r>
         <w:rPr>
-          <w:position w:val="-24"/>
-        </w:rPr>
-        <w:object w:dxaOrig="1660" w:dyaOrig="620" w14:anchorId="73444684">
-          <v:shape id="_x0000_i1106" type="#_x0000_t75" style="width:79.25pt;height:28.75pt" o:ole="">
-            <v:imagedata r:id="rId174" o:title=""/>
-          </v:shape>
-          <o:OLEObject Type="Embed" ProgID="Equation.DSMT4" ShapeID="_x0000_i1106" DrawAspect="Content" ObjectID="_1836461587" r:id="rId175"/>
+          <w:position w:val="-54"/>
+        </w:rPr>
+        <w:object w:dxaOrig="3040" w:dyaOrig="1160" w14:anchorId="7EC57D09">
+          <v:shape id="_x0000_i1116" type="#_x0000_t75" style="width:151.25pt;height:57.5pt" o:ole="">
+            <v:imagedata r:id="rId192" o:title=""/>
+          </v:shape>
+          <o:OLEObject Type="Embed" ProgID="Equation.DSMT4" ShapeID="_x0000_i1116" DrawAspect="Content" ObjectID="_1836466698" r:id="rId193"/>
         </w:object>
       </w:r>
       <w:r>
@@ -7522,7 +8153,7 @@
           <w:rPr>
             <w:noProof/>
           </w:rPr>
-          <w:instrText>51</w:instrText>
+          <w:instrText>59</w:instrText>
         </w:r>
       </w:fldSimple>
       <w:r>
@@ -7534,7 +8165,7 @@
     </w:p>
     <w:p>
       <w:r>
-        <w:t>In 3D</w:t>
+        <w:t>The solution is given by,</w:t>
       </w:r>
     </w:p>
     <w:p>
@@ -7546,13 +8177,13 @@
       </w:r>
       <w:r>
         <w:rPr>
-          <w:position w:val="-24"/>
-        </w:rPr>
-        <w:object w:dxaOrig="3060" w:dyaOrig="620" w14:anchorId="1D52241A">
-          <v:shape id="_x0000_i1107" type="#_x0000_t75" style="width:151.25pt;height:28.75pt" o:ole="">
-            <v:imagedata r:id="rId176" o:title=""/>
-          </v:shape>
-          <o:OLEObject Type="Embed" ProgID="Equation.DSMT4" ShapeID="_x0000_i1107" DrawAspect="Content" ObjectID="_1836461588" r:id="rId177"/>
+          <w:position w:val="-72"/>
+        </w:rPr>
+        <w:object w:dxaOrig="3920" w:dyaOrig="1560" w14:anchorId="795AAB77">
+          <v:shape id="_x0000_i1117" type="#_x0000_t75" style="width:194.5pt;height:79.25pt" o:ole="">
+            <v:imagedata r:id="rId194" o:title=""/>
+          </v:shape>
+          <o:OLEObject Type="Embed" ProgID="Equation.DSMT4" ShapeID="_x0000_i1117" DrawAspect="Content" ObjectID="_1836466699" r:id="rId195"/>
         </w:object>
       </w:r>
       <w:r>
@@ -7595,7 +8226,7 @@
           <w:rPr>
             <w:noProof/>
           </w:rPr>
-          <w:instrText>52</w:instrText>
+          <w:instrText>60</w:instrText>
         </w:r>
       </w:fldSimple>
       <w:r>
@@ -7607,7 +8238,32 @@
     </w:p>
     <w:p>
       <w:r>
-        <w:t>Thus,</w:t>
+        <w:tab/>
+      </w:r>
+    </w:p>
+    <w:p>
+      <w:pPr>
+        <w:pStyle w:val="Heading1"/>
+      </w:pPr>
+      <w:bookmarkStart w:id="17" w:name="_Toc225519247"/>
+      <w:r>
+        <w:t>Analytical solutions for reaction equations</w:t>
+      </w:r>
+      <w:bookmarkEnd w:id="17"/>
+    </w:p>
+    <w:p>
+      <w:pPr>
+        <w:pStyle w:val="Heading2"/>
+      </w:pPr>
+      <w:bookmarkStart w:id="18" w:name="_Toc225519248"/>
+      <w:r>
+        <w:t>Example 1</w:t>
+      </w:r>
+      <w:bookmarkEnd w:id="18"/>
+    </w:p>
+    <w:p>
+      <w:r>
+        <w:t>The reaction</w:t>
       </w:r>
     </w:p>
     <w:p>
@@ -7619,13 +8275,13 @@
       </w:r>
       <w:r>
         <w:rPr>
-          <w:position w:val="-66"/>
-        </w:rPr>
-        <w:object w:dxaOrig="4959" w:dyaOrig="1440" w14:anchorId="733FAD85">
-          <v:shape id="_x0000_i1108" type="#_x0000_t75" style="width:244.75pt;height:1in" o:ole="">
-            <v:imagedata r:id="rId178" o:title=""/>
-          </v:shape>
-          <o:OLEObject Type="Embed" ProgID="Equation.DSMT4" ShapeID="_x0000_i1108" DrawAspect="Content" ObjectID="_1836461589" r:id="rId179"/>
+          <w:position w:val="-6"/>
+        </w:rPr>
+        <w:object w:dxaOrig="680" w:dyaOrig="460" w14:anchorId="2670F555">
+          <v:shape id="_x0000_i1118" type="#_x0000_t75" style="width:36pt;height:21.5pt" o:ole="">
+            <v:imagedata r:id="rId196" o:title=""/>
+          </v:shape>
+          <o:OLEObject Type="Embed" ProgID="Equation.DSMT4" ShapeID="_x0000_i1118" DrawAspect="Content" ObjectID="_1836466700" r:id="rId197"/>
         </w:object>
       </w:r>
       <w:r>
@@ -7668,7 +8324,7 @@
           <w:rPr>
             <w:noProof/>
           </w:rPr>
-          <w:instrText>53</w:instrText>
+          <w:instrText>61</w:instrText>
         </w:r>
       </w:fldSimple>
       <w:r>
@@ -7679,14 +8335,10 @@
       </w:r>
     </w:p>
     <w:p>
-      <w:pPr>
-        <w:pStyle w:val="Heading1"/>
-      </w:pPr>
-      <w:bookmarkStart w:id="13" w:name="_Toc225519243"/>
-      <w:r>
-        <w:t>Prescribed concentrations in NL analyses</w:t>
-      </w:r>
-      <w:bookmarkEnd w:id="13"/>
+      <w:r>
+        <w:lastRenderedPageBreak/>
+        <w:t>has the following solution</w:t>
+      </w:r>
     </w:p>
     <w:p>
       <w:pPr>
@@ -7697,13 +8349,13 @@
       </w:r>
       <w:r>
         <w:rPr>
-          <w:position w:val="-16"/>
-        </w:rPr>
-        <w:object w:dxaOrig="2220" w:dyaOrig="440" w14:anchorId="6CF0AA5F">
-          <v:shape id="_x0000_i1109" type="#_x0000_t75" style="width:108pt;height:21.5pt" o:ole="">
-            <v:imagedata r:id="rId180" o:title=""/>
-          </v:shape>
-          <o:OLEObject Type="Embed" ProgID="Equation.DSMT4" ShapeID="_x0000_i1109" DrawAspect="Content" ObjectID="_1836461590" r:id="rId181"/>
+          <w:position w:val="-36"/>
+        </w:rPr>
+        <w:object w:dxaOrig="2480" w:dyaOrig="840" w14:anchorId="56809685">
+          <v:shape id="_x0000_i1119" type="#_x0000_t75" style="width:122.5pt;height:43.25pt" o:ole="">
+            <v:imagedata r:id="rId198" o:title=""/>
+          </v:shape>
+          <o:OLEObject Type="Embed" ProgID="Equation.DSMT4" ShapeID="_x0000_i1119" DrawAspect="Content" ObjectID="_1836466701" r:id="rId199"/>
         </w:object>
       </w:r>
       <w:r>
@@ -7746,7 +8398,7 @@
           <w:rPr>
             <w:noProof/>
           </w:rPr>
-          <w:instrText>54</w:instrText>
+          <w:instrText>62</w:instrText>
         </w:r>
       </w:fldSimple>
       <w:r>
@@ -7758,6 +8410,21 @@
     </w:p>
     <w:p>
       <w:pPr>
+        <w:pStyle w:val="Heading2"/>
+      </w:pPr>
+      <w:bookmarkStart w:id="19" w:name="_Toc225519249"/>
+      <w:r>
+        <w:t>Example 2</w:t>
+      </w:r>
+      <w:bookmarkEnd w:id="19"/>
+    </w:p>
+    <w:p>
+      <w:r>
+        <w:t>The reactions,</w:t>
+      </w:r>
+    </w:p>
+    <w:p>
+      <w:pPr>
         <w:pStyle w:val="MTDisplayEquation"/>
       </w:pPr>
       <w:r>
@@ -7765,13 +8432,13 @@
       </w:r>
       <w:r>
         <w:rPr>
-          <w:position w:val="-16"/>
-        </w:rPr>
-        <w:object w:dxaOrig="5360" w:dyaOrig="440" w14:anchorId="67C4DD72">
-          <v:shape id="_x0000_i1110" type="#_x0000_t75" style="width:266.5pt;height:21.5pt" o:ole="">
-            <v:imagedata r:id="rId182" o:title=""/>
-          </v:shape>
-          <o:OLEObject Type="Embed" ProgID="Equation.DSMT4" ShapeID="_x0000_i1110" DrawAspect="Content" ObjectID="_1836461591" r:id="rId183"/>
+          <w:position w:val="-42"/>
+        </w:rPr>
+        <w:object w:dxaOrig="700" w:dyaOrig="960" w14:anchorId="1E1B4196">
+          <v:shape id="_x0000_i1120" type="#_x0000_t75" style="width:36pt;height:50.5pt" o:ole="">
+            <v:imagedata r:id="rId200" o:title=""/>
+          </v:shape>
+          <o:OLEObject Type="Embed" ProgID="Equation.DSMT4" ShapeID="_x0000_i1120" DrawAspect="Content" ObjectID="_1836466702" r:id="rId201"/>
         </w:object>
       </w:r>
       <w:r>
@@ -7814,7 +8481,7 @@
           <w:rPr>
             <w:noProof/>
           </w:rPr>
-          <w:instrText>55</w:instrText>
+          <w:instrText>63</w:instrText>
         </w:r>
       </w:fldSimple>
       <w:r>
@@ -7825,32 +8492,109 @@
       </w:r>
     </w:p>
     <w:p>
-      <w:pPr>
-        <w:pStyle w:val="Heading1"/>
-      </w:pPr>
-      <w:bookmarkStart w:id="14" w:name="_Toc225519244"/>
-      <w:r>
-        <w:lastRenderedPageBreak/>
-        <w:t>Analytical solutions for diffusion equations</w:t>
-      </w:r>
-      <w:bookmarkEnd w:id="14"/>
-    </w:p>
-    <w:p>
-      <w:pPr>
-        <w:pStyle w:val="Heading2"/>
-      </w:pPr>
-      <w:bookmarkStart w:id="15" w:name="_Toc225519245"/>
-      <w:r>
-        <w:t>Example 1</w:t>
-      </w:r>
-      <w:bookmarkEnd w:id="15"/>
+      <w:r>
+        <w:t xml:space="preserve">has the following solution (for </w:t>
+      </w:r>
+      <w:r>
+        <w:rPr>
+          <w:position w:val="-12"/>
+        </w:rPr>
+        <w:object w:dxaOrig="680" w:dyaOrig="360" w14:anchorId="16AFE618">
+          <v:shape id="_x0000_i1121" type="#_x0000_t75" style="width:36pt;height:21.5pt" o:ole="">
+            <v:imagedata r:id="rId202" o:title=""/>
+          </v:shape>
+          <o:OLEObject Type="Embed" ProgID="Equation.DSMT4" ShapeID="_x0000_i1121" DrawAspect="Content" ObjectID="_1836466703" r:id="rId203"/>
+        </w:object>
+      </w:r>
+      <w:r>
+        <w:t>)</w:t>
+      </w:r>
+    </w:p>
+    <w:p>
+      <w:pPr>
+        <w:pStyle w:val="MTDisplayEquation"/>
+      </w:pPr>
+      <w:r>
+        <w:tab/>
+      </w:r>
+      <w:r>
+        <w:rPr>
+          <w:position w:val="-100"/>
+        </w:rPr>
+        <w:object w:dxaOrig="5300" w:dyaOrig="1780" w14:anchorId="751AEEF2">
+          <v:shape id="_x0000_i1122" type="#_x0000_t75" style="width:266.25pt;height:86.5pt" o:ole="">
+            <v:imagedata r:id="rId204" o:title=""/>
+          </v:shape>
+          <o:OLEObject Type="Embed" ProgID="Equation.DSMT4" ShapeID="_x0000_i1122" DrawAspect="Content" ObjectID="_1836466704" r:id="rId205"/>
+        </w:object>
+      </w:r>
       <w:r>
         <w:t xml:space="preserve"> </w:t>
       </w:r>
-    </w:p>
-    <w:p>
-      <w:r>
-        <w:t>Consider the following 1D - IC/BC problem,</w:t>
+      <w:r>
+        <w:tab/>
+      </w:r>
+      <w:r>
+        <w:fldChar w:fldCharType="begin"/>
+      </w:r>
+      <w:r>
+        <w:instrText xml:space="preserve"> MACROBUTTON MTPlaceRef \* MERGEFORMAT </w:instrText>
+      </w:r>
+      <w:r>
+        <w:fldChar w:fldCharType="begin"/>
+      </w:r>
+      <w:r>
+        <w:instrText xml:space="preserve"> SEQ MTEqn \h \* MERGEFORMAT </w:instrText>
+      </w:r>
+      <w:r>
+        <w:fldChar w:fldCharType="end"/>
+      </w:r>
+      <w:r>
+        <w:instrText>(</w:instrText>
+      </w:r>
+      <w:fldSimple w:instr=" SEQ MTSec \c \* Arabic \* MERGEFORMAT ">
+        <w:r>
+          <w:rPr>
+            <w:noProof/>
+          </w:rPr>
+          <w:instrText>1</w:instrText>
+        </w:r>
+      </w:fldSimple>
+      <w:r>
+        <w:instrText>.</w:instrText>
+      </w:r>
+      <w:fldSimple w:instr=" SEQ MTEqn \c \* Arabic \* MERGEFORMAT ">
+        <w:r>
+          <w:rPr>
+            <w:noProof/>
+          </w:rPr>
+          <w:instrText>64</w:instrText>
+        </w:r>
+      </w:fldSimple>
+      <w:r>
+        <w:instrText>)</w:instrText>
+      </w:r>
+      <w:r>
+        <w:fldChar w:fldCharType="end"/>
+      </w:r>
+    </w:p>
+    <w:p>
+      <w:r>
+        <w:t xml:space="preserve">If </w:t>
+      </w:r>
+      <w:r>
+        <w:rPr>
+          <w:position w:val="-12"/>
+        </w:rPr>
+        <w:object w:dxaOrig="680" w:dyaOrig="360" w14:anchorId="254DBE04">
+          <v:shape id="_x0000_i1123" type="#_x0000_t75" style="width:36pt;height:21.5pt" o:ole="">
+            <v:imagedata r:id="rId206" o:title=""/>
+          </v:shape>
+          <o:OLEObject Type="Embed" ProgID="Equation.DSMT4" ShapeID="_x0000_i1123" DrawAspect="Content" ObjectID="_1836466705" r:id="rId207"/>
+        </w:object>
+      </w:r>
+      <w:r>
+        <w:t>, then the solution is</w:t>
       </w:r>
     </w:p>
     <w:p>
@@ -7862,13 +8606,13 @@
       </w:r>
       <w:r>
         <w:rPr>
-          <w:position w:val="-54"/>
-        </w:rPr>
-        <w:object w:dxaOrig="3040" w:dyaOrig="1160" w14:anchorId="06703DA7">
-          <v:shape id="_x0000_i1111" type="#_x0000_t75" style="width:151.25pt;height:57.5pt" o:ole="">
-            <v:imagedata r:id="rId184" o:title=""/>
-          </v:shape>
-          <o:OLEObject Type="Embed" ProgID="Equation.DSMT4" ShapeID="_x0000_i1111" DrawAspect="Content" ObjectID="_1836461592" r:id="rId185"/>
+          <w:position w:val="-58"/>
+        </w:rPr>
+        <w:object w:dxaOrig="3120" w:dyaOrig="1240" w14:anchorId="327F5BEC">
+          <v:shape id="_x0000_i1124" type="#_x0000_t75" style="width:158.25pt;height:64.75pt" o:ole="">
+            <v:imagedata r:id="rId208" o:title=""/>
+          </v:shape>
+          <o:OLEObject Type="Embed" ProgID="Equation.DSMT4" ShapeID="_x0000_i1124" DrawAspect="Content" ObjectID="_1836466706" r:id="rId209"/>
         </w:object>
       </w:r>
       <w:r>
@@ -7911,665 +8655,7 @@
           <w:rPr>
             <w:noProof/>
           </w:rPr>
-          <w:instrText>56</w:instrText>
-        </w:r>
-      </w:fldSimple>
-      <w:r>
-        <w:instrText>)</w:instrText>
-      </w:r>
-      <w:r>
-        <w:fldChar w:fldCharType="end"/>
-      </w:r>
-    </w:p>
-    <w:p>
-      <w:r>
-        <w:t>The solution is given by,</w:t>
-      </w:r>
-    </w:p>
-    <w:p>
-      <w:pPr>
-        <w:pStyle w:val="MTDisplayEquation"/>
-      </w:pPr>
-      <w:r>
-        <w:tab/>
-      </w:r>
-      <w:r>
-        <w:rPr>
-          <w:position w:val="-66"/>
-        </w:rPr>
-        <w:object w:dxaOrig="2980" w:dyaOrig="1440" w14:anchorId="1AF9DDFA">
-          <v:shape id="_x0000_i1112" type="#_x0000_t75" style="width:151.25pt;height:1in" o:ole="">
-            <v:imagedata r:id="rId186" o:title=""/>
-          </v:shape>
-          <o:OLEObject Type="Embed" ProgID="Equation.DSMT4" ShapeID="_x0000_i1112" DrawAspect="Content" ObjectID="_1836461593" r:id="rId187"/>
-        </w:object>
-      </w:r>
-      <w:r>
-        <w:t xml:space="preserve"> </w:t>
-      </w:r>
-      <w:r>
-        <w:tab/>
-      </w:r>
-      <w:r>
-        <w:fldChar w:fldCharType="begin"/>
-      </w:r>
-      <w:r>
-        <w:instrText xml:space="preserve"> MACROBUTTON MTPlaceRef \* MERGEFORMAT </w:instrText>
-      </w:r>
-      <w:r>
-        <w:fldChar w:fldCharType="begin"/>
-      </w:r>
-      <w:r>
-        <w:instrText xml:space="preserve"> SEQ MTEqn \h \* MERGEFORMAT </w:instrText>
-      </w:r>
-      <w:r>
-        <w:fldChar w:fldCharType="end"/>
-      </w:r>
-      <w:r>
-        <w:instrText>(</w:instrText>
-      </w:r>
-      <w:fldSimple w:instr=" SEQ MTSec \c \* Arabic \* MERGEFORMAT ">
-        <w:r>
-          <w:rPr>
-            <w:noProof/>
-          </w:rPr>
-          <w:instrText>1</w:instrText>
-        </w:r>
-      </w:fldSimple>
-      <w:r>
-        <w:instrText>.</w:instrText>
-      </w:r>
-      <w:fldSimple w:instr=" SEQ MTEqn \c \* Arabic \* MERGEFORMAT ">
-        <w:r>
-          <w:rPr>
-            <w:noProof/>
-          </w:rPr>
-          <w:instrText>57</w:instrText>
-        </w:r>
-      </w:fldSimple>
-      <w:r>
-        <w:instrText>)</w:instrText>
-      </w:r>
-      <w:r>
-        <w:fldChar w:fldCharType="end"/>
-      </w:r>
-    </w:p>
-    <w:p>
-      <w:pPr>
-        <w:pStyle w:val="Heading2"/>
-      </w:pPr>
-      <w:bookmarkStart w:id="16" w:name="_Toc225519246"/>
-      <w:r>
-        <w:t>Example 2</w:t>
-      </w:r>
-      <w:bookmarkEnd w:id="16"/>
-    </w:p>
-    <w:p>
-      <w:r>
-        <w:t>Consider the following 1D - IC/BC problem,</w:t>
-      </w:r>
-    </w:p>
-    <w:p>
-      <w:pPr>
-        <w:pStyle w:val="MTDisplayEquation"/>
-      </w:pPr>
-      <w:r>
-        <w:tab/>
-      </w:r>
-      <w:r>
-        <w:rPr>
-          <w:position w:val="-54"/>
-        </w:rPr>
-        <w:object w:dxaOrig="3040" w:dyaOrig="1160" w14:anchorId="7EC57D09">
-          <v:shape id="_x0000_i1113" type="#_x0000_t75" style="width:151.25pt;height:57.5pt" o:ole="">
-            <v:imagedata r:id="rId188" o:title=""/>
-          </v:shape>
-          <o:OLEObject Type="Embed" ProgID="Equation.DSMT4" ShapeID="_x0000_i1113" DrawAspect="Content" ObjectID="_1836461594" r:id="rId189"/>
-        </w:object>
-      </w:r>
-      <w:r>
-        <w:t xml:space="preserve"> </w:t>
-      </w:r>
-      <w:r>
-        <w:tab/>
-      </w:r>
-      <w:r>
-        <w:fldChar w:fldCharType="begin"/>
-      </w:r>
-      <w:r>
-        <w:instrText xml:space="preserve"> MACROBUTTON MTPlaceRef \* MERGEFORMAT </w:instrText>
-      </w:r>
-      <w:r>
-        <w:fldChar w:fldCharType="begin"/>
-      </w:r>
-      <w:r>
-        <w:instrText xml:space="preserve"> SEQ MTEqn \h \* MERGEFORMAT </w:instrText>
-      </w:r>
-      <w:r>
-        <w:fldChar w:fldCharType="end"/>
-      </w:r>
-      <w:r>
-        <w:instrText>(</w:instrText>
-      </w:r>
-      <w:fldSimple w:instr=" SEQ MTSec \c \* Arabic \* MERGEFORMAT ">
-        <w:r>
-          <w:rPr>
-            <w:noProof/>
-          </w:rPr>
-          <w:instrText>1</w:instrText>
-        </w:r>
-      </w:fldSimple>
-      <w:r>
-        <w:instrText>.</w:instrText>
-      </w:r>
-      <w:fldSimple w:instr=" SEQ MTEqn \c \* Arabic \* MERGEFORMAT ">
-        <w:r>
-          <w:rPr>
-            <w:noProof/>
-          </w:rPr>
-          <w:instrText>58</w:instrText>
-        </w:r>
-      </w:fldSimple>
-      <w:r>
-        <w:instrText>)</w:instrText>
-      </w:r>
-      <w:r>
-        <w:fldChar w:fldCharType="end"/>
-      </w:r>
-    </w:p>
-    <w:p>
-      <w:r>
-        <w:t>The solution is given by,</w:t>
-      </w:r>
-    </w:p>
-    <w:p>
-      <w:pPr>
-        <w:pStyle w:val="MTDisplayEquation"/>
-      </w:pPr>
-      <w:r>
-        <w:tab/>
-      </w:r>
-      <w:r>
-        <w:rPr>
-          <w:position w:val="-72"/>
-        </w:rPr>
-        <w:object w:dxaOrig="3920" w:dyaOrig="1560" w14:anchorId="795AAB77">
-          <v:shape id="_x0000_i1114" type="#_x0000_t75" style="width:194.5pt;height:79.25pt" o:ole="">
-            <v:imagedata r:id="rId190" o:title=""/>
-          </v:shape>
-          <o:OLEObject Type="Embed" ProgID="Equation.DSMT4" ShapeID="_x0000_i1114" DrawAspect="Content" ObjectID="_1836461595" r:id="rId191"/>
-        </w:object>
-      </w:r>
-      <w:r>
-        <w:t xml:space="preserve"> </w:t>
-      </w:r>
-      <w:r>
-        <w:tab/>
-      </w:r>
-      <w:r>
-        <w:fldChar w:fldCharType="begin"/>
-      </w:r>
-      <w:r>
-        <w:instrText xml:space="preserve"> MACROBUTTON MTPlaceRef \* MERGEFORMAT </w:instrText>
-      </w:r>
-      <w:r>
-        <w:fldChar w:fldCharType="begin"/>
-      </w:r>
-      <w:r>
-        <w:instrText xml:space="preserve"> SEQ MTEqn \h \* MERGEFORMAT </w:instrText>
-      </w:r>
-      <w:r>
-        <w:fldChar w:fldCharType="end"/>
-      </w:r>
-      <w:r>
-        <w:instrText>(</w:instrText>
-      </w:r>
-      <w:fldSimple w:instr=" SEQ MTSec \c \* Arabic \* MERGEFORMAT ">
-        <w:r>
-          <w:rPr>
-            <w:noProof/>
-          </w:rPr>
-          <w:instrText>1</w:instrText>
-        </w:r>
-      </w:fldSimple>
-      <w:r>
-        <w:instrText>.</w:instrText>
-      </w:r>
-      <w:fldSimple w:instr=" SEQ MTEqn \c \* Arabic \* MERGEFORMAT ">
-        <w:r>
-          <w:rPr>
-            <w:noProof/>
-          </w:rPr>
-          <w:instrText>59</w:instrText>
-        </w:r>
-      </w:fldSimple>
-      <w:r>
-        <w:instrText>)</w:instrText>
-      </w:r>
-      <w:r>
-        <w:fldChar w:fldCharType="end"/>
-      </w:r>
-    </w:p>
-    <w:p>
-      <w:r>
-        <w:tab/>
-      </w:r>
-    </w:p>
-    <w:p>
-      <w:pPr>
-        <w:pStyle w:val="Heading1"/>
-      </w:pPr>
-      <w:bookmarkStart w:id="17" w:name="_Toc225519247"/>
-      <w:r>
-        <w:t>Analytical solutions for reaction equations</w:t>
-      </w:r>
-      <w:bookmarkEnd w:id="17"/>
-    </w:p>
-    <w:p>
-      <w:pPr>
-        <w:pStyle w:val="Heading2"/>
-      </w:pPr>
-      <w:bookmarkStart w:id="18" w:name="_Toc225519248"/>
-      <w:r>
-        <w:t>Example 1</w:t>
-      </w:r>
-      <w:bookmarkEnd w:id="18"/>
-    </w:p>
-    <w:p>
-      <w:r>
-        <w:t>The reaction</w:t>
-      </w:r>
-    </w:p>
-    <w:p>
-      <w:pPr>
-        <w:pStyle w:val="MTDisplayEquation"/>
-      </w:pPr>
-      <w:r>
-        <w:tab/>
-      </w:r>
-      <w:r>
-        <w:rPr>
-          <w:position w:val="-6"/>
-        </w:rPr>
-        <w:object w:dxaOrig="680" w:dyaOrig="460" w14:anchorId="2670F555">
-          <v:shape id="_x0000_i1115" type="#_x0000_t75" style="width:36pt;height:21.5pt" o:ole="">
-            <v:imagedata r:id="rId192" o:title=""/>
-          </v:shape>
-          <o:OLEObject Type="Embed" ProgID="Equation.DSMT4" ShapeID="_x0000_i1115" DrawAspect="Content" ObjectID="_1836461596" r:id="rId193"/>
-        </w:object>
-      </w:r>
-      <w:r>
-        <w:t xml:space="preserve"> </w:t>
-      </w:r>
-      <w:r>
-        <w:tab/>
-      </w:r>
-      <w:r>
-        <w:fldChar w:fldCharType="begin"/>
-      </w:r>
-      <w:r>
-        <w:instrText xml:space="preserve"> MACROBUTTON MTPlaceRef \* MERGEFORMAT </w:instrText>
-      </w:r>
-      <w:r>
-        <w:fldChar w:fldCharType="begin"/>
-      </w:r>
-      <w:r>
-        <w:instrText xml:space="preserve"> SEQ MTEqn \h \* MERGEFORMAT </w:instrText>
-      </w:r>
-      <w:r>
-        <w:fldChar w:fldCharType="end"/>
-      </w:r>
-      <w:r>
-        <w:instrText>(</w:instrText>
-      </w:r>
-      <w:fldSimple w:instr=" SEQ MTSec \c \* Arabic \* MERGEFORMAT ">
-        <w:r>
-          <w:rPr>
-            <w:noProof/>
-          </w:rPr>
-          <w:instrText>1</w:instrText>
-        </w:r>
-      </w:fldSimple>
-      <w:r>
-        <w:instrText>.</w:instrText>
-      </w:r>
-      <w:fldSimple w:instr=" SEQ MTEqn \c \* Arabic \* MERGEFORMAT ">
-        <w:r>
-          <w:rPr>
-            <w:noProof/>
-          </w:rPr>
-          <w:instrText>60</w:instrText>
-        </w:r>
-      </w:fldSimple>
-      <w:r>
-        <w:instrText>)</w:instrText>
-      </w:r>
-      <w:r>
-        <w:fldChar w:fldCharType="end"/>
-      </w:r>
-    </w:p>
-    <w:p>
-      <w:r>
-        <w:t>has the following solution</w:t>
-      </w:r>
-    </w:p>
-    <w:p>
-      <w:pPr>
-        <w:pStyle w:val="MTDisplayEquation"/>
-      </w:pPr>
-      <w:r>
-        <w:tab/>
-      </w:r>
-      <w:r>
-        <w:rPr>
-          <w:position w:val="-36"/>
-        </w:rPr>
-        <w:object w:dxaOrig="2480" w:dyaOrig="840" w14:anchorId="56809685">
-          <v:shape id="_x0000_i1116" type="#_x0000_t75" style="width:122.5pt;height:43.25pt" o:ole="">
-            <v:imagedata r:id="rId194" o:title=""/>
-          </v:shape>
-          <o:OLEObject Type="Embed" ProgID="Equation.DSMT4" ShapeID="_x0000_i1116" DrawAspect="Content" ObjectID="_1836461597" r:id="rId195"/>
-        </w:object>
-      </w:r>
-      <w:r>
-        <w:t xml:space="preserve"> </w:t>
-      </w:r>
-      <w:r>
-        <w:tab/>
-      </w:r>
-      <w:r>
-        <w:fldChar w:fldCharType="begin"/>
-      </w:r>
-      <w:r>
-        <w:instrText xml:space="preserve"> MACROBUTTON MTPlaceRef \* MERGEFORMAT </w:instrText>
-      </w:r>
-      <w:r>
-        <w:fldChar w:fldCharType="begin"/>
-      </w:r>
-      <w:r>
-        <w:instrText xml:space="preserve"> SEQ MTEqn \h \* MERGEFORMAT </w:instrText>
-      </w:r>
-      <w:r>
-        <w:fldChar w:fldCharType="end"/>
-      </w:r>
-      <w:r>
-        <w:instrText>(</w:instrText>
-      </w:r>
-      <w:fldSimple w:instr=" SEQ MTSec \c \* Arabic \* MERGEFORMAT ">
-        <w:r>
-          <w:rPr>
-            <w:noProof/>
-          </w:rPr>
-          <w:instrText>1</w:instrText>
-        </w:r>
-      </w:fldSimple>
-      <w:r>
-        <w:instrText>.</w:instrText>
-      </w:r>
-      <w:fldSimple w:instr=" SEQ MTEqn \c \* Arabic \* MERGEFORMAT ">
-        <w:r>
-          <w:rPr>
-            <w:noProof/>
-          </w:rPr>
-          <w:instrText>61</w:instrText>
-        </w:r>
-      </w:fldSimple>
-      <w:r>
-        <w:instrText>)</w:instrText>
-      </w:r>
-      <w:r>
-        <w:fldChar w:fldCharType="end"/>
-      </w:r>
-    </w:p>
-    <w:p>
-      <w:pPr>
-        <w:pStyle w:val="Heading2"/>
-      </w:pPr>
-      <w:bookmarkStart w:id="19" w:name="_Toc225519249"/>
-      <w:r>
-        <w:lastRenderedPageBreak/>
-        <w:t>Example 2</w:t>
-      </w:r>
-      <w:bookmarkEnd w:id="19"/>
-    </w:p>
-    <w:p>
-      <w:r>
-        <w:t>The reactions,</w:t>
-      </w:r>
-    </w:p>
-    <w:p>
-      <w:pPr>
-        <w:pStyle w:val="MTDisplayEquation"/>
-      </w:pPr>
-      <w:r>
-        <w:tab/>
-      </w:r>
-      <w:r>
-        <w:rPr>
-          <w:position w:val="-42"/>
-        </w:rPr>
-        <w:object w:dxaOrig="700" w:dyaOrig="960" w14:anchorId="1E1B4196">
-          <v:shape id="_x0000_i1117" type="#_x0000_t75" style="width:36pt;height:50.5pt" o:ole="">
-            <v:imagedata r:id="rId196" o:title=""/>
-          </v:shape>
-          <o:OLEObject Type="Embed" ProgID="Equation.DSMT4" ShapeID="_x0000_i1117" DrawAspect="Content" ObjectID="_1836461598" r:id="rId197"/>
-        </w:object>
-      </w:r>
-      <w:r>
-        <w:t xml:space="preserve"> </w:t>
-      </w:r>
-      <w:r>
-        <w:tab/>
-      </w:r>
-      <w:r>
-        <w:fldChar w:fldCharType="begin"/>
-      </w:r>
-      <w:r>
-        <w:instrText xml:space="preserve"> MACROBUTTON MTPlaceRef \* MERGEFORMAT </w:instrText>
-      </w:r>
-      <w:r>
-        <w:fldChar w:fldCharType="begin"/>
-      </w:r>
-      <w:r>
-        <w:instrText xml:space="preserve"> SEQ MTEqn \h \* MERGEFORMAT </w:instrText>
-      </w:r>
-      <w:r>
-        <w:fldChar w:fldCharType="end"/>
-      </w:r>
-      <w:r>
-        <w:instrText>(</w:instrText>
-      </w:r>
-      <w:fldSimple w:instr=" SEQ MTSec \c \* Arabic \* MERGEFORMAT ">
-        <w:r>
-          <w:rPr>
-            <w:noProof/>
-          </w:rPr>
-          <w:instrText>1</w:instrText>
-        </w:r>
-      </w:fldSimple>
-      <w:r>
-        <w:instrText>.</w:instrText>
-      </w:r>
-      <w:fldSimple w:instr=" SEQ MTEqn \c \* Arabic \* MERGEFORMAT ">
-        <w:r>
-          <w:rPr>
-            <w:noProof/>
-          </w:rPr>
-          <w:instrText>62</w:instrText>
-        </w:r>
-      </w:fldSimple>
-      <w:r>
-        <w:instrText>)</w:instrText>
-      </w:r>
-      <w:r>
-        <w:fldChar w:fldCharType="end"/>
-      </w:r>
-    </w:p>
-    <w:p>
-      <w:r>
-        <w:t xml:space="preserve">has the following solution (for </w:t>
-      </w:r>
-      <w:r>
-        <w:rPr>
-          <w:position w:val="-12"/>
-        </w:rPr>
-        <w:object w:dxaOrig="680" w:dyaOrig="360" w14:anchorId="16AFE618">
-          <v:shape id="_x0000_i1118" type="#_x0000_t75" style="width:36pt;height:21.5pt" o:ole="">
-            <v:imagedata r:id="rId198" o:title=""/>
-          </v:shape>
-          <o:OLEObject Type="Embed" ProgID="Equation.DSMT4" ShapeID="_x0000_i1118" DrawAspect="Content" ObjectID="_1836461599" r:id="rId199"/>
-        </w:object>
-      </w:r>
-      <w:r>
-        <w:t>)</w:t>
-      </w:r>
-    </w:p>
-    <w:p>
-      <w:pPr>
-        <w:pStyle w:val="MTDisplayEquation"/>
-      </w:pPr>
-      <w:r>
-        <w:tab/>
-      </w:r>
-      <w:r>
-        <w:rPr>
-          <w:position w:val="-100"/>
-        </w:rPr>
-        <w:object w:dxaOrig="5300" w:dyaOrig="1780" w14:anchorId="751AEEF2">
-          <v:shape id="_x0000_i1119" type="#_x0000_t75" style="width:266.25pt;height:86.5pt" o:ole="">
-            <v:imagedata r:id="rId200" o:title=""/>
-          </v:shape>
-          <o:OLEObject Type="Embed" ProgID="Equation.DSMT4" ShapeID="_x0000_i1119" DrawAspect="Content" ObjectID="_1836461600" r:id="rId201"/>
-        </w:object>
-      </w:r>
-      <w:r>
-        <w:t xml:space="preserve"> </w:t>
-      </w:r>
-      <w:r>
-        <w:tab/>
-      </w:r>
-      <w:r>
-        <w:fldChar w:fldCharType="begin"/>
-      </w:r>
-      <w:r>
-        <w:instrText xml:space="preserve"> MACROBUTTON MTPlaceRef \* MERGEFORMAT </w:instrText>
-      </w:r>
-      <w:r>
-        <w:fldChar w:fldCharType="begin"/>
-      </w:r>
-      <w:r>
-        <w:instrText xml:space="preserve"> SEQ MTEqn \h \* MERGEFORMAT </w:instrText>
-      </w:r>
-      <w:r>
-        <w:fldChar w:fldCharType="end"/>
-      </w:r>
-      <w:r>
-        <w:instrText>(</w:instrText>
-      </w:r>
-      <w:fldSimple w:instr=" SEQ MTSec \c \* Arabic \* MERGEFORMAT ">
-        <w:r>
-          <w:rPr>
-            <w:noProof/>
-          </w:rPr>
-          <w:instrText>1</w:instrText>
-        </w:r>
-      </w:fldSimple>
-      <w:r>
-        <w:instrText>.</w:instrText>
-      </w:r>
-      <w:fldSimple w:instr=" SEQ MTEqn \c \* Arabic \* MERGEFORMAT ">
-        <w:r>
-          <w:rPr>
-            <w:noProof/>
-          </w:rPr>
-          <w:instrText>63</w:instrText>
-        </w:r>
-      </w:fldSimple>
-      <w:r>
-        <w:instrText>)</w:instrText>
-      </w:r>
-      <w:r>
-        <w:fldChar w:fldCharType="end"/>
-      </w:r>
-    </w:p>
-    <w:p>
-      <w:r>
-        <w:t xml:space="preserve">If </w:t>
-      </w:r>
-      <w:r>
-        <w:rPr>
-          <w:position w:val="-12"/>
-        </w:rPr>
-        <w:object w:dxaOrig="680" w:dyaOrig="360" w14:anchorId="254DBE04">
-          <v:shape id="_x0000_i1120" type="#_x0000_t75" style="width:36pt;height:21.5pt" o:ole="">
-            <v:imagedata r:id="rId202" o:title=""/>
-          </v:shape>
-          <o:OLEObject Type="Embed" ProgID="Equation.DSMT4" ShapeID="_x0000_i1120" DrawAspect="Content" ObjectID="_1836461601" r:id="rId203"/>
-        </w:object>
-      </w:r>
-      <w:r>
-        <w:t>, then the solution is</w:t>
-      </w:r>
-    </w:p>
-    <w:p>
-      <w:pPr>
-        <w:pStyle w:val="MTDisplayEquation"/>
-      </w:pPr>
-      <w:r>
-        <w:tab/>
-      </w:r>
-      <w:r>
-        <w:rPr>
-          <w:position w:val="-58"/>
-        </w:rPr>
-        <w:object w:dxaOrig="3120" w:dyaOrig="1240" w14:anchorId="327F5BEC">
-          <v:shape id="_x0000_i1121" type="#_x0000_t75" style="width:158.25pt;height:64.75pt" o:ole="">
-            <v:imagedata r:id="rId204" o:title=""/>
-          </v:shape>
-          <o:OLEObject Type="Embed" ProgID="Equation.DSMT4" ShapeID="_x0000_i1121" DrawAspect="Content" ObjectID="_1836461602" r:id="rId205"/>
-        </w:object>
-      </w:r>
-      <w:r>
-        <w:t xml:space="preserve"> </w:t>
-      </w:r>
-      <w:r>
-        <w:tab/>
-      </w:r>
-      <w:r>
-        <w:fldChar w:fldCharType="begin"/>
-      </w:r>
-      <w:r>
-        <w:instrText xml:space="preserve"> MACROBUTTON MTPlaceRef \* MERGEFORMAT </w:instrText>
-      </w:r>
-      <w:r>
-        <w:fldChar w:fldCharType="begin"/>
-      </w:r>
-      <w:r>
-        <w:instrText xml:space="preserve"> SEQ MTEqn \h \* MERGEFORMAT </w:instrText>
-      </w:r>
-      <w:r>
-        <w:fldChar w:fldCharType="end"/>
-      </w:r>
-      <w:r>
-        <w:instrText>(</w:instrText>
-      </w:r>
-      <w:fldSimple w:instr=" SEQ MTSec \c \* Arabic \* MERGEFORMAT ">
-        <w:r>
-          <w:rPr>
-            <w:noProof/>
-          </w:rPr>
-          <w:instrText>1</w:instrText>
-        </w:r>
-      </w:fldSimple>
-      <w:r>
-        <w:instrText>.</w:instrText>
-      </w:r>
-      <w:fldSimple w:instr=" SEQ MTEqn \c \* Arabic \* MERGEFORMAT ">
-        <w:r>
-          <w:rPr>
-            <w:noProof/>
-          </w:rPr>
-          <w:instrText>64</w:instrText>
+          <w:instrText>65</w:instrText>
         </w:r>
       </w:fldSimple>
       <w:r>

</xml_diff>